<commit_message>
dokumentáció 3/3, bővítés előtt
</commit_message>
<xml_diff>
--- a/megvalósítási ötletek, teendők.docx
+++ b/megvalósítási ötletek, teendők.docx
@@ -10,13 +10,8 @@
           <w:numId w:val="1"/>
         </w:numPr>
       </w:pPr>
-      <w:proofErr w:type="spellStart"/>
       <w:r>
-        <w:t>CookieYes</w:t>
-      </w:r>
-      <w:proofErr w:type="spellEnd"/>
-      <w:r>
-        <w:t>-t fel lehet rakni az oldalra?</w:t>
+        <w:t>CookieYes-t fel lehet rakni az oldalra?</w:t>
       </w:r>
       <w:r>
         <w:t xml:space="preserve"> Ha igen, belefoglalni az adatvédelem, biztonság pontba a dokumentációban</w:t>
@@ -31,7 +26,7 @@
         </w:numPr>
       </w:pPr>
       <w:r>
-        <w:t>A rendszer oldalairól is kéne beszélni külön-külön</w:t>
+        <w:t>AZ EGYIK ELSŐ A KERESÉSI FUNKCIÓ LEGYEN</w:t>
       </w:r>
     </w:p>
     <w:p>
@@ -43,7 +38,7 @@
         </w:numPr>
       </w:pPr>
       <w:r>
-        <w:t>AZ EGYIK ELSŐ A KERESÉSI FUNKCIÓ LEGYEN</w:t>
+        <w:t>admin manuális foglalás hozzáadás és egyben regisztráció vagy akár csak vendégként</w:t>
       </w:r>
     </w:p>
     <w:p>
@@ -54,13 +49,8 @@
           <w:numId w:val="1"/>
         </w:numPr>
       </w:pPr>
-      <w:proofErr w:type="spellStart"/>
       <w:r>
-        <w:t>admin</w:t>
-      </w:r>
-      <w:proofErr w:type="spellEnd"/>
-      <w:r>
-        <w:t xml:space="preserve"> manuális foglalás hozzáadás és egyben regisztráció vagy akár csak vendégként</w:t>
+        <w:t>admin és felhasználó foglalás módosítás és lemondás</w:t>
       </w:r>
     </w:p>
     <w:p>
@@ -71,13 +61,8 @@
           <w:numId w:val="1"/>
         </w:numPr>
       </w:pPr>
-      <w:proofErr w:type="spellStart"/>
       <w:r>
-        <w:t>admin</w:t>
-      </w:r>
-      <w:proofErr w:type="spellEnd"/>
-      <w:r>
-        <w:t xml:space="preserve"> és felhasználó foglalás módosítás és lemondás</w:t>
+        <w:t>tényleg MariaDB-t használunk?</w:t>
       </w:r>
     </w:p>
     <w:p>
@@ -89,43 +74,7 @@
         </w:numPr>
       </w:pPr>
       <w:r>
-        <w:t xml:space="preserve">tényleg </w:t>
-      </w:r>
-      <w:proofErr w:type="spellStart"/>
-      <w:r>
-        <w:t>MariaDB</w:t>
-      </w:r>
-      <w:proofErr w:type="spellEnd"/>
-      <w:r>
-        <w:t>-t használunk?</w:t>
-      </w:r>
-    </w:p>
-    <w:p>
-      <w:pPr>
-        <w:pStyle w:val="Listaszerbekezds"/>
-        <w:numPr>
-          <w:ilvl w:val="0"/>
-          <w:numId w:val="1"/>
-        </w:numPr>
-      </w:pPr>
-      <w:r>
-        <w:t xml:space="preserve">a </w:t>
-      </w:r>
-      <w:proofErr w:type="spellStart"/>
-      <w:r>
-        <w:t>security-hez</w:t>
-      </w:r>
-      <w:proofErr w:type="spellEnd"/>
-      <w:r>
-        <w:t xml:space="preserve"> a </w:t>
-      </w:r>
-      <w:proofErr w:type="spellStart"/>
-      <w:r>
-        <w:t>cors</w:t>
-      </w:r>
-      <w:proofErr w:type="spellEnd"/>
-      <w:r>
-        <w:t xml:space="preserve"> mehet?</w:t>
+        <w:t>animációk beleírása a dokuba</w:t>
       </w:r>
     </w:p>
     <w:sectPr>

</xml_diff>

<commit_message>
hibajavítások, foglalási folyamat logika elkezdése
</commit_message>
<xml_diff>
--- a/megvalósítási ötletek, teendők.docx
+++ b/megvalósítási ötletek, teendők.docx
@@ -64,6 +64,9 @@
       <w:r>
         <w:t>tényleg MariaDB-t használunk?</w:t>
       </w:r>
+      <w:r>
+        <w:t xml:space="preserve"> Igen</w:t>
+      </w:r>
     </w:p>
     <w:p>
       <w:pPr>
@@ -87,6 +90,45 @@
       </w:pPr>
       <w:r>
         <w:t>admin oldalon a felhasználók kilistázása és kezelése  (pl. adatok törlése)</w:t>
+      </w:r>
+    </w:p>
+    <w:p>
+      <w:pPr>
+        <w:pStyle w:val="Listaszerbekezds"/>
+        <w:numPr>
+          <w:ilvl w:val="0"/>
+          <w:numId w:val="1"/>
+        </w:numPr>
+      </w:pPr>
+      <w:r>
+        <w:t>framer-motion a dokumentációba belerakni</w:t>
+      </w:r>
+    </w:p>
+    <w:p>
+      <w:pPr>
+        <w:pStyle w:val="Listaszerbekezds"/>
+        <w:numPr>
+          <w:ilvl w:val="0"/>
+          <w:numId w:val="1"/>
+        </w:numPr>
+      </w:pPr>
+      <w:r>
+        <w:t>admin kijelentkezik automatikusan ha elkattintok másik oldalra és az adminon nincs kijelentkezés – ezt megcsinálni</w:t>
+      </w:r>
+      <w:r>
+        <w:t>, legyen visszanyíl benne, hogy a fő admin oldalon legyünk</w:t>
+      </w:r>
+    </w:p>
+    <w:p>
+      <w:pPr>
+        <w:pStyle w:val="Listaszerbekezds"/>
+        <w:numPr>
+          <w:ilvl w:val="0"/>
+          <w:numId w:val="1"/>
+        </w:numPr>
+      </w:pPr>
+      <w:r>
+        <w:t>ne egyszerre legyen a GDPR és az ÁSZF elfogadása</w:t>
       </w:r>
     </w:p>
     <w:sectPr>

</xml_diff>

<commit_message>
részben kész foglalási logika
</commit_message>
<xml_diff>
--- a/megvalósítási ötletek, teendők.docx
+++ b/megvalósítási ötletek, teendők.docx
@@ -129,6 +129,18 @@
       </w:pPr>
       <w:r>
         <w:t>ne egyszerre legyen a GDPR és az ÁSZF elfogadása</w:t>
+      </w:r>
+    </w:p>
+    <w:p>
+      <w:pPr>
+        <w:pStyle w:val="Listaszerbekezds"/>
+        <w:numPr>
+          <w:ilvl w:val="0"/>
+          <w:numId w:val="1"/>
+        </w:numPr>
+      </w:pPr>
+      <w:r>
+        <w:t>Gerő azt mondta, hogy ágyak szerint szokott lenni, tehát ha 1 ágyas, amire 2 fő fér rá, akkor 1 és 2 főre ugyanannyi</w:t>
       </w:r>
     </w:p>
     <w:sectPr>

</xml_diff>

<commit_message>
több kép megadási lehetőség és foglalási funkció folytatása
</commit_message>
<xml_diff>
--- a/megvalósítási ötletek, teendők.docx
+++ b/megvalósítási ötletek, teendők.docx
@@ -141,6 +141,51 @@
       </w:pPr>
       <w:r>
         <w:t>Gerő azt mondta, hogy ágyak szerint szokott lenni, tehát ha 1 ágyas, amire 2 fő fér rá, akkor 1 és 2 főre ugyanannyi</w:t>
+      </w:r>
+    </w:p>
+    <w:p>
+      <w:pPr>
+        <w:pStyle w:val="Listaszerbekezds"/>
+        <w:numPr>
+          <w:ilvl w:val="0"/>
+          <w:numId w:val="1"/>
+        </w:numPr>
+      </w:pPr>
+      <w:r>
+        <w:t xml:space="preserve"> jwt kulcs belerakni a doksiba?</w:t>
+      </w:r>
+    </w:p>
+    <w:p>
+      <w:pPr>
+        <w:pStyle w:val="Listaszerbekezds"/>
+        <w:numPr>
+          <w:ilvl w:val="0"/>
+          <w:numId w:val="1"/>
+        </w:numPr>
+      </w:pPr>
+      <w:r>
+        <w:t>az images oszlop a room táblában JSON lett</w:t>
+      </w:r>
+      <w:r>
+        <w:t>, ami útvonalakat tárol</w:t>
+      </w:r>
+      <w:r>
+        <w:t xml:space="preserve"> – így életszerűbb</w:t>
+      </w:r>
+    </w:p>
+    <w:p>
+      <w:pPr>
+        <w:pStyle w:val="Listaszerbekezds"/>
+        <w:numPr>
+          <w:ilvl w:val="0"/>
+          <w:numId w:val="1"/>
+        </w:numPr>
+      </w:pPr>
+      <w:r>
+        <w:t>adminkezeles oldalon a szoba típusa helyett kategória legyen, placeholder is ezt tükrözze, és alapvetően egy dropdown legyen és egy opció, hogy több hozzáadása</w:t>
+      </w:r>
+      <w:r>
+        <w:t xml:space="preserve"> + kép hozzáadása, ha nincs még, ha van, akkor írja ki csak, hogy csere</w:t>
       </w:r>
     </w:p>
     <w:sectPr>

</xml_diff>

<commit_message>
több kép feltöltési lehetőség + életszerűbb
multer modul telepítés fájlfeltöltés miatt és működő több kép feltöltési lehetőség. Életszerűbbé lett téve a képfeltöltés, mivel most nem blob-ként, hanem útvonalként ment az adatbázisba. Az adminkezeles-en hibajavítások, server.js módosítása ennek megfelelően
</commit_message>
<xml_diff>
--- a/megvalósítási ötletek, teendők.docx
+++ b/megvalósítási ötletek, teendők.docx
@@ -186,6 +186,24 @@
       </w:r>
       <w:r>
         <w:t xml:space="preserve"> + kép hozzáadása, ha nincs még, ha van, akkor írja ki csak, hogy csere</w:t>
+      </w:r>
+    </w:p>
+    <w:p>
+      <w:pPr>
+        <w:pStyle w:val="Listaszerbekezds"/>
+        <w:numPr>
+          <w:ilvl w:val="0"/>
+          <w:numId w:val="1"/>
+        </w:numPr>
+      </w:pPr>
+      <w:r>
+        <w:t xml:space="preserve">doksiba beleírni, hogy multer </w:t>
+      </w:r>
+      <w:r>
+        <w:t>modult</w:t>
+      </w:r>
+      <w:r>
+        <w:t xml:space="preserve"> is használunk, ami a fájlfeltöltést teszi lehetővé</w:t>
       </w:r>
     </w:p>
     <w:sectPr>

</xml_diff>

<commit_message>
megvalósítási ötletek update és bugfix
</commit_message>
<xml_diff>
--- a/megvalósítási ötletek, teendők.docx
+++ b/megvalósítási ötletek, teendők.docx
@@ -835,6 +835,9 @@
       <w:r>
         <w:t>booking tábla összeg</w:t>
       </w:r>
+      <w:r>
+        <w:t xml:space="preserve"> legyen benne és az admin-on is írja oda a foglalás összegét + ne id-kat, hanem felhasználóneveket írjon meg szobaneveket</w:t>
+      </w:r>
     </w:p>
     <w:p>
       <w:pPr>
@@ -909,6 +912,42 @@
       </w:pPr>
       <w:r>
         <w:t>admin oldal visszajelzés, hogy mit kell feltölteni, nem csak hiba</w:t>
+      </w:r>
+    </w:p>
+    <w:p>
+      <w:pPr>
+        <w:numPr>
+          <w:ilvl w:val="0"/>
+          <w:numId w:val="1"/>
+        </w:numPr>
+        <w:pBdr>
+          <w:top w:val="nil"/>
+          <w:left w:val="nil"/>
+          <w:bottom w:val="nil"/>
+          <w:right w:val="nil"/>
+          <w:between w:val="nil"/>
+        </w:pBdr>
+      </w:pPr>
+      <w:r>
+        <w:t>Foglalás leadva oldal, miután a room-on leadtam a foglalást</w:t>
+      </w:r>
+    </w:p>
+    <w:p>
+      <w:pPr>
+        <w:numPr>
+          <w:ilvl w:val="0"/>
+          <w:numId w:val="1"/>
+        </w:numPr>
+        <w:pBdr>
+          <w:top w:val="nil"/>
+          <w:left w:val="nil"/>
+          <w:bottom w:val="nil"/>
+          <w:right w:val="nil"/>
+          <w:between w:val="nil"/>
+        </w:pBdr>
+      </w:pPr>
+      <w:r>
+        <w:t>regisztráció bejelentkezés oldal dizájnhoz hasonló legyen és legyen alul mint a room-on hogy elfoglalja az ászf-et és az adatkezelést</w:t>
       </w:r>
     </w:p>
     <w:sectPr>

</xml_diff>

<commit_message>
foglalással kapcsolatos emailek - DONE
</commit_message>
<xml_diff>
--- a/megvalósítási ötletek, teendők.docx
+++ b/megvalósítási ötletek, teendők.docx
@@ -92,10 +92,7 @@
         <w:t>az oldal nem veszti el a session-t</w:t>
       </w:r>
       <w:r>
-        <w:t xml:space="preserve">. </w:t>
-      </w:r>
-      <w:r>
-        <w:t>a navigation a login és a backend életszerűen, rendesen kezeli a session-t, localStorage-ben elmenti, a navbar pedig szépen fog megjelenni, bejelentkezés után avatar-al, névvel és kijelentkezés gombbal + adminon admin gombbal. automata redirect oldalfrissítéssel. ha admin, akkor /admin, ha sima felhasználó, akkor a főoldalra.</w:t>
+        <w:t>. a navigation a login és a backend életszerűen, rendesen kezeli a session-t, localStorage-ben elmenti, a navbar pedig szépen fog megjelenni, bejelentkezés után avatar-al, névvel és kijelentkezés gombbal + adminon admin gombbal. automata redirect oldalfrissítéssel. ha admin, akkor /admin, ha sima felhasználó, akkor a főoldalra.</w:t>
       </w:r>
       <w:r>
         <w:t xml:space="preserve"> - dokuba</w:t>
@@ -296,22 +293,11 @@
       </w:pPr>
       <w:r>
         <w:lastRenderedPageBreak/>
-        <w:t xml:space="preserve">a room táblában isHighlighted – így a Home oldalra is fel lehet majd rakni a kiemelteket + az adminkezeles oldalon az ac_availability-nek van egy checkbox </w:t>
-      </w:r>
-      <w:r>
-        <w:t xml:space="preserve"> + room oldalon kell egy ilyen megjelenítés, hogy van-e klíma meg esetleg, hogy kiemelt</w:t>
-      </w:r>
-    </w:p>
-    <w:p>
-      <w:pPr>
-        <w:numPr>
-          <w:ilvl w:val="0"/>
-          <w:numId w:val="2"/>
-        </w:numPr>
-      </w:pPr>
-      <w:r>
         <w:t>url-be bejelentkezés nélkül ne lehessen beírni az admin url-t. bármelyiket is. mind protected legyen. + 404 oldal kell</w:t>
       </w:r>
+      <w:r>
+        <w:t xml:space="preserve"> - dokuba</w:t>
+      </w:r>
     </w:p>
     <w:p>
       <w:pPr>
@@ -332,17 +318,6 @@
         </w:numPr>
       </w:pPr>
       <w:r>
-        <w:t>az értékelések ai moderálása?</w:t>
-      </w:r>
-    </w:p>
-    <w:p>
-      <w:pPr>
-        <w:numPr>
-          <w:ilvl w:val="0"/>
-          <w:numId w:val="2"/>
-        </w:numPr>
-      </w:pPr>
-      <w:r>
         <w:t>értékelések átlagja az adminon , a room és a home oldalon a kártyákon megjelenik. – dokuba</w:t>
       </w:r>
     </w:p>
@@ -409,7 +384,7 @@
         </w:numPr>
       </w:pPr>
       <w:r>
-        <w:t>Jelentkezz be elsőnek gomb vagy visszairányít majd</w:t>
+        <w:t>Foglaláskor ha nincs bejelentkezve és bejelentkezik, megjegyzi a beállításokat és visszairányít vagy ha elkattint akkor is - dokuba</w:t>
       </w:r>
     </w:p>
     <w:p>
@@ -431,103 +406,57 @@
         </w:numPr>
       </w:pPr>
       <w:r>
-        <w:t>vélemény írásnál ne frissüljön az oldal f5-ösen, hanem csak simán</w:t>
-      </w:r>
-    </w:p>
-    <w:p>
-      <w:pPr>
-        <w:numPr>
-          <w:ilvl w:val="0"/>
-          <w:numId w:val="2"/>
-        </w:numPr>
-      </w:pPr>
-      <w:r>
         <w:t>felhasználó beállítások, miket foglalt, kezelés, stb</w:t>
       </w:r>
-    </w:p>
-    <w:p>
-      <w:pPr>
-        <w:numPr>
-          <w:ilvl w:val="0"/>
-          <w:numId w:val="2"/>
-        </w:numPr>
-      </w:pPr>
-      <w:r>
-        <w:t>booking tábla összeg legyen benne és az admin-on is írja oda a foglalás összegét + ne id-kat, hanem felhasználóneveket írjon meg szobaneveket</w:t>
-      </w:r>
-    </w:p>
-    <w:p>
-      <w:pPr>
-        <w:numPr>
-          <w:ilvl w:val="0"/>
-          <w:numId w:val="2"/>
-        </w:numPr>
-      </w:pPr>
-      <w:r>
-        <w:t>frontend-en kezeli a fizetést, át lehet írni a főket, hogy hány fő – ami az árban fog frissülni</w:t>
-      </w:r>
-    </w:p>
-    <w:p>
-      <w:pPr>
-        <w:numPr>
-          <w:ilvl w:val="0"/>
-          <w:numId w:val="2"/>
-        </w:numPr>
-      </w:pPr>
-      <w:r>
-        <w:t>kategória kezelés: home, admin</w:t>
-      </w:r>
-    </w:p>
-    <w:p>
-      <w:pPr>
-        <w:numPr>
-          <w:ilvl w:val="0"/>
-          <w:numId w:val="2"/>
-        </w:numPr>
-      </w:pPr>
-      <w:r>
-        <w:t>nodemailer (emailek mindenhez, adatmódosításhoz is, persze adatok nélkül)</w:t>
-      </w:r>
-    </w:p>
-    <w:p>
-      <w:pPr>
-        <w:numPr>
-          <w:ilvl w:val="0"/>
-          <w:numId w:val="2"/>
-        </w:numPr>
-      </w:pPr>
-      <w:r>
-        <w:lastRenderedPageBreak/>
-        <w:t>admin oldal visszajelzés, hogy mit kell feltölteni, nem csak hiba</w:t>
-      </w:r>
-    </w:p>
-    <w:p>
-      <w:pPr>
-        <w:numPr>
-          <w:ilvl w:val="0"/>
-          <w:numId w:val="2"/>
-        </w:numPr>
-      </w:pPr>
-      <w:r>
-        <w:t>Foglalás leadva oldal, miután a room-on leadtam a foglalást</w:t>
-      </w:r>
-    </w:p>
-    <w:p>
-      <w:pPr>
-        <w:numPr>
-          <w:ilvl w:val="0"/>
-          <w:numId w:val="2"/>
-        </w:numPr>
-      </w:pPr>
-      <w:r>
-        <w:t>regisztráció bejelentkezés oldal dizájnhoz hasonló, elfogadja az ászf-et és az adatkezelést + visszaigazoló e-mail (tehát nem automata, így biztonságos és profi, életszerű, a regisztráció gomb egy tokent generál amit majd a felhasználó az emailben kapott kóddal validál) - dokuba</w:t>
-      </w:r>
-    </w:p>
-    <w:p>
-      <w:pPr>
-        <w:numPr>
-          <w:ilvl w:val="0"/>
-          <w:numId w:val="1"/>
+      <w:r>
+        <w:t xml:space="preserve"> </w:t>
+      </w:r>
+      <w:r>
+        <w:t>–</w:t>
+      </w:r>
+      <w:r>
+        <w:t xml:space="preserve"> dokuba</w:t>
+      </w:r>
+    </w:p>
+    <w:p>
+      <w:pPr>
+        <w:numPr>
+          <w:ilvl w:val="0"/>
+          <w:numId w:val="2"/>
+        </w:numPr>
+      </w:pPr>
+      <w:r>
+        <w:t xml:space="preserve">kategória kezelés: home, admin </w:t>
+      </w:r>
+      <w:r>
+        <w:t>–</w:t>
+      </w:r>
+      <w:r>
+        <w:t xml:space="preserve"> dokuba</w:t>
+      </w:r>
+    </w:p>
+    <w:p>
+      <w:pPr>
+        <w:numPr>
+          <w:ilvl w:val="0"/>
+          <w:numId w:val="2"/>
+        </w:numPr>
+      </w:pPr>
+      <w:r>
+        <w:t xml:space="preserve">regisztráció bejelentkezés oldal dizájnhoz hasonló, elfogadja az ászf-et és az adatkezelést + visszaigazoló e-mail (tehát nem automata, így biztonságos és profi, életszerű, a regisztráció gomb egy tokent generál amit majd a felhasználó az emailben kapott kóddal validál) </w:t>
+      </w:r>
+      <w:r>
+        <w:t>–</w:t>
+      </w:r>
+      <w:r>
+        <w:t xml:space="preserve"> dokuba</w:t>
+      </w:r>
+    </w:p>
+    <w:p>
+      <w:pPr>
+        <w:numPr>
+          <w:ilvl w:val="0"/>
+          <w:numId w:val="2"/>
         </w:numPr>
         <w:pBdr>
           <w:top w:val="nil"/>
@@ -539,7 +468,55 @@
         <w:spacing w:after="0"/>
       </w:pPr>
       <w:r>
-        <w:t>legutóbbi adatbázist kell mindenhova írni, dokuba, diagramokhoz, stb</w:t>
+        <w:t>legutóbbi adatbázist kell mindenhova írni - dokuba</w:t>
+      </w:r>
+    </w:p>
+    <w:p>
+      <w:pPr>
+        <w:numPr>
+          <w:ilvl w:val="0"/>
+          <w:numId w:val="2"/>
+        </w:numPr>
+      </w:pPr>
+      <w:r>
+        <w:t>booking tábla összeg legyen benne és az admin-on is írja oda a foglalás összegét + ne id-kat, hanem felhasználóneveket írjon meg szobaneveket</w:t>
+      </w:r>
+    </w:p>
+    <w:p>
+      <w:pPr>
+        <w:numPr>
+          <w:ilvl w:val="0"/>
+          <w:numId w:val="2"/>
+        </w:numPr>
+      </w:pPr>
+      <w:r>
+        <w:t>frontend-en kezeli a fizetést, át lehet írni a főket, hogy hány fő – ami az árban fog frissülni</w:t>
+      </w:r>
+      <w:r>
+        <w:t xml:space="preserve"> - JAVÍTANI</w:t>
+      </w:r>
+    </w:p>
+    <w:p>
+      <w:pPr>
+        <w:numPr>
+          <w:ilvl w:val="0"/>
+          <w:numId w:val="2"/>
+        </w:numPr>
+      </w:pPr>
+      <w:r>
+        <w:lastRenderedPageBreak/>
+        <w:t>nodemailer (emailek mindenhez, adatmódosításhoz is, persze adatok nélkül)</w:t>
+      </w:r>
+    </w:p>
+    <w:p>
+      <w:pPr>
+        <w:numPr>
+          <w:ilvl w:val="0"/>
+          <w:numId w:val="2"/>
+        </w:numPr>
+      </w:pPr>
+      <w:r>
+        <w:t>admin oldal visszajelzés, hogy mit kell feltölteni, nem csak hiba</w:t>
       </w:r>
     </w:p>
     <w:p>
@@ -557,7 +534,10 @@
         </w:pBdr>
       </w:pPr>
       <w:r>
-        <w:t>az oldalak betöltése ne középen legyen, tehát ha pl a home oldalon középen voltam, rányomtam egy szobára, akkor a room oldalnak ne a közepe, hanem a tetejétől kezdődően jelenejn meg. ez mindenhol</w:t>
+        <w:t>a room és kategóriánál az url-ben ne id, hanem név legyen, tehát nem /rooms/1, hanem rooms/valami_szoba (vagy akár magyarosítani)</w:t>
+      </w:r>
+      <w:r>
+        <w:t xml:space="preserve"> – kész - dokuba</w:t>
       </w:r>
     </w:p>
     <w:p>
@@ -566,16 +546,13 @@
           <w:ilvl w:val="0"/>
           <w:numId w:val="1"/>
         </w:numPr>
-        <w:pBdr>
-          <w:top w:val="nil"/>
-          <w:left w:val="nil"/>
-          <w:bottom w:val="nil"/>
-          <w:right w:val="nil"/>
-          <w:between w:val="nil"/>
-        </w:pBdr>
-      </w:pPr>
-      <w:r>
-        <w:t>a room és kategóriánál az url-ben ne id, hanem név legyen, tehát nem /rooms/1, hanem rooms/valami_szoba (vagy akár magyarosítani)</w:t>
+        <w:spacing w:after="0"/>
+      </w:pPr>
+      <w:r>
+        <w:t xml:space="preserve">adminkezeles oldalon </w:t>
+      </w:r>
+      <w:r>
+        <w:t xml:space="preserve"> kategória hozzáadása link, és redirect</w:t>
       </w:r>
     </w:p>
     <w:p>
@@ -587,7 +564,7 @@
         <w:spacing w:after="0"/>
       </w:pPr>
       <w:r>
-        <w:t>adminkezeles oldalon a szoba típusa helyett kategória legyen, placeholder is ezt tükrözze, és alapvetően egy dropdown legyen és egy opció, hogy több hozzáadása + kép hozzáadása, ha nincs még, ha van, akkor írja ki csak, hogy csere</w:t>
+        <w:t>a foglalás időtartama, a két dátum ne legyen datetime, hanem csak date, mert így hajnali 2 óra van megadva az adminon</w:t>
       </w:r>
     </w:p>
     <w:p>
@@ -599,32 +576,240 @@
         <w:spacing w:after="0"/>
       </w:pPr>
       <w:r>
-        <w:t>a foglalás időtartama, a két dátum ne legyen datetime, hanem csak date, mert így hajnali 2 óra van megadva az adminon</w:t>
-      </w:r>
-    </w:p>
-    <w:p>
-      <w:pPr>
-        <w:spacing w:after="0"/>
-      </w:pPr>
-    </w:p>
-    <w:p>
-      <w:pPr>
-        <w:spacing w:after="0"/>
-      </w:pPr>
-    </w:p>
-    <w:p>
-      <w:pPr>
-        <w:spacing w:after="0"/>
-      </w:pPr>
-    </w:p>
-    <w:p>
-      <w:pPr>
-        <w:numPr>
-          <w:ilvl w:val="0"/>
-          <w:numId w:val="2"/>
-        </w:numPr>
-      </w:pPr>
-      <w:r>
+        <w:t>a login és regisztráció videó vízjelének eltüntetése</w:t>
+      </w:r>
+    </w:p>
+    <w:p>
+      <w:pPr>
+        <w:pStyle w:val="Listaszerbekezds"/>
+        <w:numPr>
+          <w:ilvl w:val="0"/>
+          <w:numId w:val="1"/>
+        </w:numPr>
+        <w:spacing w:after="0"/>
+      </w:pPr>
+      <w:r>
+        <w:t>értékelés módosítása opció</w:t>
+      </w:r>
+    </w:p>
+    <w:p>
+      <w:pPr>
+        <w:pStyle w:val="Listaszerbekezds"/>
+        <w:numPr>
+          <w:ilvl w:val="0"/>
+          <w:numId w:val="1"/>
+        </w:numPr>
+        <w:spacing w:after="0"/>
+      </w:pPr>
+      <w:r>
+        <w:t>room értékeléskor pipa legyen az alsó résznél és ne legyen frissülés f5-el, hanem csak megjelenik az értékelés + módosítás</w:t>
+      </w:r>
+      <w:r>
+        <w:t xml:space="preserve"> + a szoba név alatt bold legyen egy szöveg, hogy melyik kategóriába tartozik</w:t>
+      </w:r>
+    </w:p>
+    <w:p>
+      <w:pPr>
+        <w:pStyle w:val="Listaszerbekezds"/>
+        <w:numPr>
+          <w:ilvl w:val="0"/>
+          <w:numId w:val="1"/>
+        </w:numPr>
+        <w:spacing w:after="0"/>
+      </w:pPr>
+      <w:r>
+        <w:t>ha lemondom a foglalást, akkor már következőleg nem fog működni a 15% kedvezmény, hiába az lesz az első tulajdonképpen</w:t>
+      </w:r>
+    </w:p>
+    <w:p>
+      <w:pPr>
+        <w:pStyle w:val="Listaszerbekezds"/>
+        <w:numPr>
+          <w:ilvl w:val="0"/>
+          <w:numId w:val="1"/>
+        </w:numPr>
+        <w:spacing w:after="0"/>
+      </w:pPr>
+      <w:r>
+        <w:t>a room foglalás utáni confirmationban legyen benne, hogy hova utaljon és mennyit és mi a foglalás száma (id, amit az emailben is ír)</w:t>
+      </w:r>
+      <w:r>
+        <w:t xml:space="preserve"> + az legyen a szöveg, hogy köszönjük a foglalást</w:t>
+      </w:r>
+    </w:p>
+    <w:p>
+      <w:pPr>
+        <w:numPr>
+          <w:ilvl w:val="0"/>
+          <w:numId w:val="1"/>
+        </w:numPr>
+      </w:pPr>
+      <w:r>
+        <w:t>a room táblában isHighlighted – így a Home oldalra is fel lehet majd rakni a kiemelteket + az adminkezeles oldalon az ac_availability-nek van egy checkbox  + room oldalon kell egy ilyen megjelenítés, hogy van-e klíma meg esetleg, hogy kiemelt</w:t>
+      </w:r>
+      <w:r>
+        <w:t xml:space="preserve"> + vélemény írásnál egy graph, hogy x/200 betű és nem enged többet</w:t>
+      </w:r>
+    </w:p>
+    <w:p>
+      <w:pPr>
+        <w:numPr>
+          <w:ilvl w:val="0"/>
+          <w:numId w:val="1"/>
+        </w:numPr>
+      </w:pPr>
+      <w:r>
+        <w:t>a saját kezelés</w:t>
+      </w:r>
+      <w:r>
+        <w:t xml:space="preserve"> meg az admin foglalások</w:t>
+      </w:r>
+      <w:r>
+        <w:t xml:space="preserve"> oldalon magyarul legyen, tehát a foglalás státusza pl magyar legyen</w:t>
+      </w:r>
+    </w:p>
+    <w:p>
+      <w:pPr>
+        <w:numPr>
+          <w:ilvl w:val="0"/>
+          <w:numId w:val="1"/>
+        </w:numPr>
+      </w:pPr>
+      <w:r>
+        <w:t>saját kezelés legyen dátum melyiket mikor foglalta</w:t>
+      </w:r>
+      <w:r>
+        <w:t xml:space="preserve"> + adatmódosításnál új jelszó megerősítése</w:t>
+      </w:r>
+      <w:r>
+        <w:t xml:space="preserve"> + telefonszámhoz ne lehessen több karakter ott sem</w:t>
+      </w:r>
+      <w:r>
+        <w:t xml:space="preserve"> és a +36 fix legyen</w:t>
+      </w:r>
+      <w:r>
+        <w:t xml:space="preserve"> + amikor adatfrissítés van akkor kapjon emailt</w:t>
+      </w:r>
+    </w:p>
+    <w:p>
+      <w:pPr>
+        <w:numPr>
+          <w:ilvl w:val="0"/>
+          <w:numId w:val="1"/>
+        </w:numPr>
+      </w:pPr>
+      <w:r>
+        <w:t>a room oldalon, amikor a foglalást leadom és még nem jött be az oldal, akkor ne jelenjen meg sárga üzenetként a room oldalon, hogy már van ott függő foglalás</w:t>
+      </w:r>
+    </w:p>
+    <w:p>
+      <w:pPr>
+        <w:numPr>
+          <w:ilvl w:val="0"/>
+          <w:numId w:val="1"/>
+        </w:numPr>
+      </w:pPr>
+      <w:r>
+        <w:t>admin foglalások oldalon ne id-kat írjon ki és ne legyen frissítés gomb meg vissza a szobákhoz se legyen</w:t>
+      </w:r>
+      <w:r>
+        <w:t xml:space="preserve"> + ne férőhelyet, mert nem az, hanem, hogy vendégek száma</w:t>
+      </w:r>
+    </w:p>
+    <w:p>
+      <w:pPr>
+        <w:numPr>
+          <w:ilvl w:val="0"/>
+          <w:numId w:val="1"/>
+        </w:numPr>
+      </w:pPr>
+      <w:r>
+        <w:t>regisztráció oldalon az email küldve zöld üzenet lent legyen, ne fent</w:t>
+      </w:r>
+    </w:p>
+    <w:p>
+      <w:pPr>
+        <w:numPr>
+          <w:ilvl w:val="0"/>
+          <w:numId w:val="1"/>
+        </w:numPr>
+      </w:pPr>
+      <w:r>
+        <w:t>alertek helyett rendes üzenetek</w:t>
+      </w:r>
+      <w:r>
+        <w:t xml:space="preserve"> középen</w:t>
+      </w:r>
+      <w:r>
+        <w:t xml:space="preserve"> és kuka gombok a kártyák jobb felső sarkában az adminon</w:t>
+      </w:r>
+    </w:p>
+    <w:p>
+      <w:pPr>
+        <w:numPr>
+          <w:ilvl w:val="0"/>
+          <w:numId w:val="1"/>
+        </w:numPr>
+      </w:pPr>
+      <w:r>
+        <w:t>category és room nincs összekötve? a room-on nem a category_id van, hanem a megnevezése</w:t>
+      </w:r>
+    </w:p>
+    <w:p>
+      <w:pPr>
+        <w:numPr>
+          <w:ilvl w:val="0"/>
+          <w:numId w:val="1"/>
+        </w:numPr>
+      </w:pPr>
+      <w:r>
+        <w:t>filter SZAR</w:t>
+      </w:r>
+    </w:p>
+    <w:p>
+      <w:pPr>
+        <w:numPr>
+          <w:ilvl w:val="0"/>
+          <w:numId w:val="1"/>
+        </w:numPr>
+      </w:pPr>
+      <w:r>
+        <w:t>admin sidebaron a foglalást nem jelzi</w:t>
+      </w:r>
+      <w:r>
+        <w:t>, a jóváhagyásra várók számát kéne mindig kiírnia, így nincs baj a session problémával</w:t>
+      </w:r>
+      <w:r>
+        <w:t>, ha bejön új és ha új session van, kiírja a felhasználóknál a piros karikában a számot, hogy vannak újak, pedig csak új session van, meg nem is kéne ott lennie, mert irreleváns</w:t>
+      </w:r>
+    </w:p>
+    <w:p>
+      <w:pPr>
+        <w:pStyle w:val="Listaszerbekezds"/>
+        <w:numPr>
+          <w:ilvl w:val="0"/>
+          <w:numId w:val="2"/>
+        </w:numPr>
+        <w:spacing w:after="0"/>
+      </w:pPr>
+      <w:r>
+        <w:t>értékelések email adminnak?</w:t>
+      </w:r>
+    </w:p>
+    <w:p>
+      <w:pPr>
+        <w:spacing w:after="0"/>
+      </w:pPr>
+    </w:p>
+    <w:p>
+      <w:pPr>
+        <w:numPr>
+          <w:ilvl w:val="0"/>
+          <w:numId w:val="2"/>
+        </w:numPr>
+      </w:pPr>
+      <w:r>
+        <w:lastRenderedPageBreak/>
         <w:t>a figma terveket ezek szerint módosítani kell</w:t>
       </w:r>
     </w:p>
@@ -1472,6 +1657,17 @@
       <w:szCs w:val="48"/>
     </w:rPr>
   </w:style>
+  <w:style w:type="paragraph" w:styleId="Listaszerbekezds">
+    <w:name w:val="List Paragraph"/>
+    <w:basedOn w:val="Norml"/>
+    <w:uiPriority w:val="34"/>
+    <w:qFormat/>
+    <w:rsid w:val="00D53F18"/>
+    <w:pPr>
+      <w:ind w:left="720"/>
+      <w:contextualSpacing/>
+    </w:pPr>
+  </w:style>
 </w:styles>
 </file>
 

</xml_diff>

<commit_message>
vegleges adatbazis hiba kijavítva
</commit_message>
<xml_diff>
--- a/megvalósítási ötletek, teendők.docx
+++ b/megvalósítási ötletek, teendők.docx
@@ -10,8 +10,53 @@
         </w:numPr>
         <w:spacing w:after="0"/>
       </w:pPr>
-      <w:r>
-        <w:t>cookie consent banner, kategóriákkal, 3 gombbal (elfogad, elutasít, testreszabás) és a testreszabás után minden egyes kategóriát személyre lehet szabni. GDPR szerint az üzenet bizonyos időnként újra felugrik, hogy meg lehessen változtatni a beállítást. animációkkal jelenik meg és tűnik el a két ablak (az alap és a testreszabás) és bal-lent van egy ikon, mint a cookieyes-nél, hogy meg lehessen változtatni a beállítást bármikor. mind szakszerű és reszponzív - belefoglalni az adatvédelem, biztonság pontba a dokumentációban</w:t>
+      <w:proofErr w:type="spellStart"/>
+      <w:r>
+        <w:t>cookie</w:t>
+      </w:r>
+      <w:proofErr w:type="spellEnd"/>
+      <w:r>
+        <w:t xml:space="preserve"> </w:t>
+      </w:r>
+      <w:proofErr w:type="spellStart"/>
+      <w:r>
+        <w:t>consent</w:t>
+      </w:r>
+      <w:proofErr w:type="spellEnd"/>
+      <w:r>
+        <w:t xml:space="preserve"> banner, kategóriákkal, 3 gombbal (elfogad, elutasít, </w:t>
+      </w:r>
+      <w:proofErr w:type="spellStart"/>
+      <w:r>
+        <w:t>testreszabás</w:t>
+      </w:r>
+      <w:proofErr w:type="spellEnd"/>
+      <w:r>
+        <w:t xml:space="preserve">) és a </w:t>
+      </w:r>
+      <w:proofErr w:type="spellStart"/>
+      <w:r>
+        <w:t>testreszabás</w:t>
+      </w:r>
+      <w:proofErr w:type="spellEnd"/>
+      <w:r>
+        <w:t xml:space="preserve"> után minden egyes kategóriát személyre lehet szabni. GDPR szerint az üzenet bizonyos időnként újra felugrik, hogy meg lehessen változtatni a beállítást. animációkkal jelenik meg és tűnik el a két ablak (az alap és a </w:t>
+      </w:r>
+      <w:proofErr w:type="spellStart"/>
+      <w:r>
+        <w:t>testreszabás</w:t>
+      </w:r>
+      <w:proofErr w:type="spellEnd"/>
+      <w:r>
+        <w:t xml:space="preserve">) és bal-lent van egy ikon, mint a </w:t>
+      </w:r>
+      <w:proofErr w:type="spellStart"/>
+      <w:r>
+        <w:t>cookieyes</w:t>
+      </w:r>
+      <w:proofErr w:type="spellEnd"/>
+      <w:r>
+        <w:t>-nél, hogy meg lehessen változtatni a beállítást bármikor. mind szakszerű és reszponzív - belefoglalni az adatvédelem, biztonság pontba a dokumentációban</w:t>
       </w:r>
     </w:p>
     <w:p>
@@ -22,8 +67,13 @@
         </w:numPr>
         <w:spacing w:after="0"/>
       </w:pPr>
-      <w:r>
-        <w:t>admin manuális foglalás hozzáadás és egyben regisztráció vagy akár csak vendégként - NEM LESZ ILYEN, HA VAN A DOKUBAN, KI KELL SZEDNI</w:t>
+      <w:proofErr w:type="spellStart"/>
+      <w:r>
+        <w:t>admin</w:t>
+      </w:r>
+      <w:proofErr w:type="spellEnd"/>
+      <w:r>
+        <w:t xml:space="preserve"> manuális foglalás hozzáadás és egyben regisztráció vagy akár csak vendégként - NEM LESZ ILYEN, HA VAN A DOKUBAN, KI KELL SZEDNI</w:t>
       </w:r>
     </w:p>
     <w:p>
@@ -35,8 +85,13 @@
         <w:spacing w:after="0"/>
       </w:pPr>
       <w:r>
-        <w:t>felhasználó foglalás lemondás - dokuba</w:t>
-      </w:r>
+        <w:t xml:space="preserve">felhasználó foglalás lemondás - </w:t>
+      </w:r>
+      <w:proofErr w:type="spellStart"/>
+      <w:r>
+        <w:t>dokuba</w:t>
+      </w:r>
+      <w:proofErr w:type="spellEnd"/>
     </w:p>
     <w:p>
       <w:pPr>
@@ -47,8 +102,13 @@
         <w:spacing w:after="0"/>
       </w:pPr>
       <w:r>
-        <w:t>animációk beleírása a dokuba</w:t>
-      </w:r>
+        <w:t xml:space="preserve">animációk beleírása a </w:t>
+      </w:r>
+      <w:proofErr w:type="spellStart"/>
+      <w:r>
+        <w:t>dokuba</w:t>
+      </w:r>
+      <w:proofErr w:type="spellEnd"/>
     </w:p>
     <w:p>
       <w:pPr>
@@ -58,12 +118,22 @@
         </w:numPr>
         <w:spacing w:after="0"/>
       </w:pPr>
-      <w:r>
-        <w:t>admin oldalon a felhasználók kilistázása és kezelése  (pl. adatok törlése)</w:t>
-      </w:r>
-      <w:r>
-        <w:t xml:space="preserve"> - dokuba</w:t>
-      </w:r>
+      <w:proofErr w:type="spellStart"/>
+      <w:r>
+        <w:t>admin</w:t>
+      </w:r>
+      <w:proofErr w:type="spellEnd"/>
+      <w:r>
+        <w:t xml:space="preserve"> oldalon a felhasználók kilistázása és kezelése  (pl. adatok törlése)</w:t>
+      </w:r>
+      <w:r>
+        <w:t xml:space="preserve"> - </w:t>
+      </w:r>
+      <w:proofErr w:type="spellStart"/>
+      <w:r>
+        <w:t>dokuba</w:t>
+      </w:r>
+      <w:proofErr w:type="spellEnd"/>
     </w:p>
     <w:p>
       <w:pPr>
@@ -73,8 +143,13 @@
         </w:numPr>
         <w:spacing w:after="0"/>
       </w:pPr>
-      <w:r>
-        <w:t>framer-motion a dokumentációba belerakni</w:t>
+      <w:proofErr w:type="spellStart"/>
+      <w:r>
+        <w:t>framer-motion</w:t>
+      </w:r>
+      <w:proofErr w:type="spellEnd"/>
+      <w:r>
+        <w:t xml:space="preserve"> a dokumentációba belerakni</w:t>
       </w:r>
     </w:p>
     <w:p>
@@ -85,18 +160,108 @@
         </w:numPr>
         <w:spacing w:after="0"/>
       </w:pPr>
-      <w:r>
-        <w:t xml:space="preserve">admin és felhasználó session kezelés, </w:t>
+      <w:proofErr w:type="spellStart"/>
+      <w:r>
+        <w:t>admin</w:t>
+      </w:r>
+      <w:proofErr w:type="spellEnd"/>
+      <w:r>
+        <w:t xml:space="preserve"> és felhasználó session kezelés, </w:t>
       </w:r>
       <w:r>
         <w:t>az oldal nem veszti el a session-t</w:t>
       </w:r>
       <w:r>
-        <w:t>. a navigation a login és a backend életszerűen, rendesen kezeli a session-t, localStorage-ben elmenti, a navbar pedig szépen fog megjelenni, bejelentkezés után avatar-al, névvel és kijelentkezés gombbal + adminon admin gombbal. automata redirect oldalfrissítéssel. ha admin, akkor /admin, ha sima felhasználó, akkor a főoldalra.</w:t>
-      </w:r>
-      <w:r>
-        <w:t xml:space="preserve"> - dokuba</w:t>
-      </w:r>
+        <w:t xml:space="preserve">. a </w:t>
+      </w:r>
+      <w:proofErr w:type="spellStart"/>
+      <w:r>
+        <w:t>navigation</w:t>
+      </w:r>
+      <w:proofErr w:type="spellEnd"/>
+      <w:r>
+        <w:t xml:space="preserve"> a login és a backend </w:t>
+      </w:r>
+      <w:proofErr w:type="spellStart"/>
+      <w:r>
+        <w:t>életszerűen</w:t>
+      </w:r>
+      <w:proofErr w:type="spellEnd"/>
+      <w:r>
+        <w:t xml:space="preserve">, rendesen kezeli a session-t, </w:t>
+      </w:r>
+      <w:proofErr w:type="spellStart"/>
+      <w:r>
+        <w:t>localStorage</w:t>
+      </w:r>
+      <w:proofErr w:type="spellEnd"/>
+      <w:r>
+        <w:t xml:space="preserve">-ben elmenti, a </w:t>
+      </w:r>
+      <w:proofErr w:type="spellStart"/>
+      <w:r>
+        <w:t>navbar</w:t>
+      </w:r>
+      <w:proofErr w:type="spellEnd"/>
+      <w:r>
+        <w:t xml:space="preserve"> pedig szépen fog megjelenni, bejelentkezés után </w:t>
+      </w:r>
+      <w:proofErr w:type="spellStart"/>
+      <w:r>
+        <w:t>avatar-al</w:t>
+      </w:r>
+      <w:proofErr w:type="spellEnd"/>
+      <w:r>
+        <w:t xml:space="preserve">, névvel és kijelentkezés gombbal + </w:t>
+      </w:r>
+      <w:proofErr w:type="spellStart"/>
+      <w:r>
+        <w:t>adminon</w:t>
+      </w:r>
+      <w:proofErr w:type="spellEnd"/>
+      <w:r>
+        <w:t xml:space="preserve"> </w:t>
+      </w:r>
+      <w:proofErr w:type="spellStart"/>
+      <w:r>
+        <w:t>admin</w:t>
+      </w:r>
+      <w:proofErr w:type="spellEnd"/>
+      <w:r>
+        <w:t xml:space="preserve"> gombbal. automata </w:t>
+      </w:r>
+      <w:proofErr w:type="spellStart"/>
+      <w:r>
+        <w:t>redirect</w:t>
+      </w:r>
+      <w:proofErr w:type="spellEnd"/>
+      <w:r>
+        <w:t xml:space="preserve"> oldalfrissítéssel. ha </w:t>
+      </w:r>
+      <w:proofErr w:type="spellStart"/>
+      <w:r>
+        <w:t>admin</w:t>
+      </w:r>
+      <w:proofErr w:type="spellEnd"/>
+      <w:r>
+        <w:t>, akkor /</w:t>
+      </w:r>
+      <w:proofErr w:type="spellStart"/>
+      <w:r>
+        <w:t>admin</w:t>
+      </w:r>
+      <w:proofErr w:type="spellEnd"/>
+      <w:r>
+        <w:t>, ha sima felhasználó, akkor a főoldalra.</w:t>
+      </w:r>
+      <w:r>
+        <w:t xml:space="preserve"> - </w:t>
+      </w:r>
+      <w:proofErr w:type="spellStart"/>
+      <w:r>
+        <w:t>dokuba</w:t>
+      </w:r>
+      <w:proofErr w:type="spellEnd"/>
     </w:p>
     <w:p>
       <w:pPr>
@@ -106,8 +271,13 @@
         </w:numPr>
         <w:spacing w:after="0"/>
       </w:pPr>
-      <w:r>
-        <w:t>jwt kulcs belerakni a doksiba?</w:t>
+      <w:proofErr w:type="spellStart"/>
+      <w:r>
+        <w:t>jwt</w:t>
+      </w:r>
+      <w:proofErr w:type="spellEnd"/>
+      <w:r>
+        <w:t xml:space="preserve"> kulcs belerakni a doksiba?</w:t>
       </w:r>
     </w:p>
     <w:p>
@@ -119,7 +289,23 @@
         <w:spacing w:after="0"/>
       </w:pPr>
       <w:r>
-        <w:t>az images oszlop a room táblában JSON lett, ami útvonalakat tárol – így életszerűbb és több képet tudunk a szobához megjeleníteni</w:t>
+        <w:t xml:space="preserve">az </w:t>
+      </w:r>
+      <w:proofErr w:type="spellStart"/>
+      <w:r>
+        <w:t>images</w:t>
+      </w:r>
+      <w:proofErr w:type="spellEnd"/>
+      <w:r>
+        <w:t xml:space="preserve"> oszlop a </w:t>
+      </w:r>
+      <w:proofErr w:type="spellStart"/>
+      <w:r>
+        <w:t>room</w:t>
+      </w:r>
+      <w:proofErr w:type="spellEnd"/>
+      <w:r>
+        <w:t xml:space="preserve"> táblában JSON lett, ami útvonalakat tárol – így életszerűbb és több képet tudunk a szobához megjeleníteni</w:t>
       </w:r>
       <w:r>
         <w:t xml:space="preserve"> </w:t>
@@ -128,8 +314,13 @@
         <w:t>–</w:t>
       </w:r>
       <w:r>
-        <w:t xml:space="preserve"> dokuba</w:t>
-      </w:r>
+        <w:t xml:space="preserve"> </w:t>
+      </w:r>
+      <w:proofErr w:type="spellStart"/>
+      <w:r>
+        <w:t>dokuba</w:t>
+      </w:r>
+      <w:proofErr w:type="spellEnd"/>
     </w:p>
     <w:p>
       <w:pPr>
@@ -146,8 +337,29 @@
         </w:pBdr>
       </w:pPr>
       <w:r>
-        <w:t>kategória adatbázis tábla is hozzáadva (id, name, image) – dokuba</w:t>
-      </w:r>
+        <w:t>kategória adatbázis tábla is hozzáadva (</w:t>
+      </w:r>
+      <w:proofErr w:type="spellStart"/>
+      <w:r>
+        <w:t>id</w:t>
+      </w:r>
+      <w:proofErr w:type="spellEnd"/>
+      <w:r>
+        <w:t xml:space="preserve">, </w:t>
+      </w:r>
+      <w:proofErr w:type="spellStart"/>
+      <w:r>
+        <w:t>name</w:t>
+      </w:r>
+      <w:proofErr w:type="spellEnd"/>
+      <w:r>
+        <w:t xml:space="preserve">, image) – </w:t>
+      </w:r>
+      <w:proofErr w:type="spellStart"/>
+      <w:r>
+        <w:t>dokuba</w:t>
+      </w:r>
+      <w:proofErr w:type="spellEnd"/>
     </w:p>
     <w:p>
       <w:pPr>
@@ -164,8 +376,13 @@
         </w:pBdr>
       </w:pPr>
       <w:r>
-        <w:t>szűrés funkciót részletezni dokuban</w:t>
-      </w:r>
+        <w:t xml:space="preserve">szűrés funkciót részletezni </w:t>
+      </w:r>
+      <w:proofErr w:type="spellStart"/>
+      <w:r>
+        <w:t>dokuban</w:t>
+      </w:r>
+      <w:proofErr w:type="spellEnd"/>
     </w:p>
     <w:p>
       <w:pPr>
@@ -176,7 +393,15 @@
         <w:spacing w:after="0"/>
       </w:pPr>
       <w:r>
-        <w:t>doksiba beleírni, hogy multer modult is használunk, ami a fájlfeltöltést teszi lehetővé</w:t>
+        <w:t xml:space="preserve">doksiba beleírni, hogy </w:t>
+      </w:r>
+      <w:proofErr w:type="spellStart"/>
+      <w:r>
+        <w:t>multer</w:t>
+      </w:r>
+      <w:proofErr w:type="spellEnd"/>
+      <w:r>
+        <w:t xml:space="preserve"> modult is használunk, ami a fájlfeltöltést teszi lehetővé</w:t>
       </w:r>
     </w:p>
     <w:p>
@@ -187,8 +412,61 @@
         </w:numPr>
         <w:spacing w:after="0"/>
       </w:pPr>
-      <w:r>
-        <w:t xml:space="preserve">full screen overlay a room képen slide-al, tehát lehet jobbra balra húzni és bejön a kövi/előző kép dokuba </w:t>
+      <w:proofErr w:type="spellStart"/>
+      <w:r>
+        <w:t>full</w:t>
+      </w:r>
+      <w:proofErr w:type="spellEnd"/>
+      <w:r>
+        <w:t xml:space="preserve"> </w:t>
+      </w:r>
+      <w:proofErr w:type="spellStart"/>
+      <w:r>
+        <w:t>screen</w:t>
+      </w:r>
+      <w:proofErr w:type="spellEnd"/>
+      <w:r>
+        <w:t xml:space="preserve"> </w:t>
+      </w:r>
+      <w:proofErr w:type="spellStart"/>
+      <w:r>
+        <w:t>overlay</w:t>
+      </w:r>
+      <w:proofErr w:type="spellEnd"/>
+      <w:r>
+        <w:t xml:space="preserve"> a </w:t>
+      </w:r>
+      <w:proofErr w:type="spellStart"/>
+      <w:r>
+        <w:t>room</w:t>
+      </w:r>
+      <w:proofErr w:type="spellEnd"/>
+      <w:r>
+        <w:t xml:space="preserve"> képen </w:t>
+      </w:r>
+      <w:proofErr w:type="spellStart"/>
+      <w:r>
+        <w:t>slide-al</w:t>
+      </w:r>
+      <w:proofErr w:type="spellEnd"/>
+      <w:r>
+        <w:t xml:space="preserve">, tehát lehet jobbra balra húzni és bejön a </w:t>
+      </w:r>
+      <w:proofErr w:type="spellStart"/>
+      <w:r>
+        <w:t>kövi</w:t>
+      </w:r>
+      <w:proofErr w:type="spellEnd"/>
+      <w:r>
+        <w:t xml:space="preserve">/előző kép </w:t>
+      </w:r>
+      <w:proofErr w:type="spellStart"/>
+      <w:r>
+        <w:t>dokuba</w:t>
+      </w:r>
+      <w:proofErr w:type="spellEnd"/>
+      <w:r>
+        <w:t xml:space="preserve"> </w:t>
       </w:r>
     </w:p>
     <w:p>
@@ -199,9 +477,27 @@
         </w:numPr>
         <w:spacing w:after="0"/>
       </w:pPr>
-      <w:r>
-        <w:t>footer és header reszponzív dokuba</w:t>
-      </w:r>
+      <w:proofErr w:type="spellStart"/>
+      <w:r>
+        <w:t>footer</w:t>
+      </w:r>
+      <w:proofErr w:type="spellEnd"/>
+      <w:r>
+        <w:t xml:space="preserve"> és </w:t>
+      </w:r>
+      <w:proofErr w:type="spellStart"/>
+      <w:r>
+        <w:t>header</w:t>
+      </w:r>
+      <w:proofErr w:type="spellEnd"/>
+      <w:r>
+        <w:t xml:space="preserve"> reszponzív </w:t>
+      </w:r>
+      <w:proofErr w:type="spellStart"/>
+      <w:r>
+        <w:t>dokuba</w:t>
+      </w:r>
+      <w:proofErr w:type="spellEnd"/>
     </w:p>
     <w:p>
       <w:pPr>
@@ -212,245 +508,639 @@
         <w:spacing w:after="0"/>
       </w:pPr>
       <w:r>
-        <w:t>rengeteg animáció az oldalon dokuba</w:t>
-      </w:r>
-    </w:p>
-    <w:p>
-      <w:pPr>
-        <w:numPr>
-          <w:ilvl w:val="0"/>
-          <w:numId w:val="2"/>
-        </w:numPr>
-      </w:pPr>
-      <w:r>
-        <w:t>room oldal bejövő animáció + automatán tudja milyen nap van, visszafelé nem enged foglalni és automatikusan az adott hónap jelenik meg a naptárban. + kinézet módosítás, nincs naptár megnyitása gomb, hanem automatikusan megjelenik + error-t jobb alsó sarokban megjeleníti - dokuba</w:t>
-      </w:r>
-    </w:p>
-    <w:p>
-      <w:pPr>
-        <w:numPr>
-          <w:ilvl w:val="0"/>
-          <w:numId w:val="2"/>
-        </w:numPr>
-      </w:pPr>
-      <w:r>
-        <w:t>a foglalás dátuma datetime és automatán tudja az óraátállítást kezelni - dokuba</w:t>
-      </w:r>
-    </w:p>
-    <w:p>
-      <w:pPr>
-        <w:numPr>
-          <w:ilvl w:val="0"/>
-          <w:numId w:val="2"/>
-        </w:numPr>
-      </w:pPr>
-      <w:r>
-        <w:t>a room oldalon a foglalás, tekintettel arra, hogy pl 10-én ha elmegy a vendég, akkor 10-én napközben már jöhet a következő, életszerű megoldást használunk és az érintett érkezés és távozás dátuma csak félig van beszínezve a room oldalon és a foglalás eszerint van engedélyezve és vezetve az adatbázisban (asszem ilyen rész van a dokuba, ezt csak módosítani kell)</w:t>
-      </w:r>
-    </w:p>
-    <w:p>
-      <w:pPr>
-        <w:numPr>
-          <w:ilvl w:val="0"/>
-          <w:numId w:val="2"/>
-        </w:numPr>
-      </w:pPr>
-      <w:r>
-        <w:t>inkább a fő admin oldalon kellenének, hogy a (pending) foglalások és az értékelések legyenek? - ha igen, akkor plusz oldalak – igen, vannak plusz oldalak és az admin-on minden dolgot másik oldalon kezelünk, hogy életszerűbb legyen - doku módosítás</w:t>
-      </w:r>
-    </w:p>
-    <w:p>
-      <w:pPr>
-        <w:numPr>
-          <w:ilvl w:val="0"/>
-          <w:numId w:val="2"/>
-        </w:numPr>
-      </w:pPr>
-      <w:r>
-        <w:t>sidebar-ban szereplő dolgok kezelését felírni a dokuba</w:t>
-      </w:r>
-    </w:p>
-    <w:p>
-      <w:pPr>
-        <w:numPr>
-          <w:ilvl w:val="0"/>
-          <w:numId w:val="2"/>
-        </w:numPr>
-      </w:pPr>
-      <w:r>
-        <w:t>1. foglalás a database-ben és eszerint kaphat kedvezményt.</w:t>
-      </w:r>
-      <w:r>
-        <w:t xml:space="preserve"> - dokuba</w:t>
-      </w:r>
-    </w:p>
-    <w:p>
-      <w:pPr>
-        <w:numPr>
-          <w:ilvl w:val="0"/>
-          <w:numId w:val="2"/>
-        </w:numPr>
-      </w:pPr>
+        <w:t xml:space="preserve">rengeteg animáció az oldalon </w:t>
+      </w:r>
+      <w:proofErr w:type="spellStart"/>
+      <w:r>
+        <w:t>dokuba</w:t>
+      </w:r>
+      <w:proofErr w:type="spellEnd"/>
+    </w:p>
+    <w:p>
+      <w:pPr>
+        <w:numPr>
+          <w:ilvl w:val="0"/>
+          <w:numId w:val="2"/>
+        </w:numPr>
+      </w:pPr>
+      <w:proofErr w:type="spellStart"/>
+      <w:r>
+        <w:t>room</w:t>
+      </w:r>
+      <w:proofErr w:type="spellEnd"/>
+      <w:r>
+        <w:t xml:space="preserve"> oldal bejövő animáció + automatán tudja milyen nap van, visszafelé nem enged foglalni és automatikusan az adott hónap jelenik meg a naptárban. + kinézet módosítás, nincs naptár megnyitása gomb, hanem automatikusan megjelenik + </w:t>
+      </w:r>
+      <w:proofErr w:type="spellStart"/>
+      <w:r>
+        <w:t>error</w:t>
+      </w:r>
+      <w:proofErr w:type="spellEnd"/>
+      <w:r>
+        <w:t xml:space="preserve">-t jobb alsó sarokban megjeleníti - </w:t>
+      </w:r>
+      <w:proofErr w:type="spellStart"/>
+      <w:r>
+        <w:t>dokuba</w:t>
+      </w:r>
+      <w:proofErr w:type="spellEnd"/>
+    </w:p>
+    <w:p>
+      <w:pPr>
+        <w:numPr>
+          <w:ilvl w:val="0"/>
+          <w:numId w:val="2"/>
+        </w:numPr>
+      </w:pPr>
+      <w:r>
+        <w:t xml:space="preserve">a foglalás dátuma </w:t>
+      </w:r>
+      <w:proofErr w:type="spellStart"/>
+      <w:r>
+        <w:t>datetime</w:t>
+      </w:r>
+      <w:proofErr w:type="spellEnd"/>
+      <w:r>
+        <w:t xml:space="preserve"> és automatán tudja az óraátállítást kezelni - </w:t>
+      </w:r>
+      <w:proofErr w:type="spellStart"/>
+      <w:r>
+        <w:t>dokuba</w:t>
+      </w:r>
+      <w:proofErr w:type="spellEnd"/>
+    </w:p>
+    <w:p>
+      <w:pPr>
+        <w:numPr>
+          <w:ilvl w:val="0"/>
+          <w:numId w:val="2"/>
+        </w:numPr>
+      </w:pPr>
+      <w:r>
+        <w:t xml:space="preserve">a </w:t>
+      </w:r>
+      <w:proofErr w:type="spellStart"/>
+      <w:r>
+        <w:t>room</w:t>
+      </w:r>
+      <w:proofErr w:type="spellEnd"/>
+      <w:r>
+        <w:t xml:space="preserve"> oldalon a foglalás, tekintettel arra, hogy </w:t>
+      </w:r>
+      <w:proofErr w:type="spellStart"/>
+      <w:r>
+        <w:t>pl</w:t>
+      </w:r>
+      <w:proofErr w:type="spellEnd"/>
+      <w:r>
+        <w:t xml:space="preserve"> 10-én ha elmegy a vendég, akkor 10-én napközben már jöhet a következő, életszerű megoldást használunk és az érintett érkezés és távozás dátuma csak félig van beszínezve a </w:t>
+      </w:r>
+      <w:proofErr w:type="spellStart"/>
+      <w:r>
+        <w:t>room</w:t>
+      </w:r>
+      <w:proofErr w:type="spellEnd"/>
+      <w:r>
+        <w:t xml:space="preserve"> oldalon és a foglalás eszerint van engedélyezve és vezetve az adatbázisban (</w:t>
+      </w:r>
+      <w:proofErr w:type="spellStart"/>
+      <w:r>
+        <w:t>asszem</w:t>
+      </w:r>
+      <w:proofErr w:type="spellEnd"/>
+      <w:r>
+        <w:t xml:space="preserve"> ilyen rész van a </w:t>
+      </w:r>
+      <w:proofErr w:type="spellStart"/>
+      <w:r>
+        <w:t>dokuba</w:t>
+      </w:r>
+      <w:proofErr w:type="spellEnd"/>
+      <w:r>
+        <w:t>, ezt csak módosítani kell)</w:t>
+      </w:r>
+    </w:p>
+    <w:p>
+      <w:pPr>
+        <w:numPr>
+          <w:ilvl w:val="0"/>
+          <w:numId w:val="2"/>
+        </w:numPr>
+      </w:pPr>
+      <w:r>
+        <w:t xml:space="preserve">inkább a fő </w:t>
+      </w:r>
+      <w:proofErr w:type="spellStart"/>
+      <w:r>
+        <w:t>admin</w:t>
+      </w:r>
+      <w:proofErr w:type="spellEnd"/>
+      <w:r>
+        <w:t xml:space="preserve"> oldalon kellenének, hogy a (</w:t>
+      </w:r>
+      <w:proofErr w:type="spellStart"/>
+      <w:r>
+        <w:t>pending</w:t>
+      </w:r>
+      <w:proofErr w:type="spellEnd"/>
+      <w:r>
+        <w:t xml:space="preserve">) foglalások és az értékelések legyenek? - ha igen, akkor plusz oldalak – igen, vannak plusz oldalak és az </w:t>
+      </w:r>
+      <w:proofErr w:type="spellStart"/>
+      <w:r>
+        <w:t>admin-on</w:t>
+      </w:r>
+      <w:proofErr w:type="spellEnd"/>
+      <w:r>
+        <w:t xml:space="preserve"> minden dolgot másik oldalon kezelünk, hogy életszerűbb legyen - </w:t>
+      </w:r>
+      <w:proofErr w:type="spellStart"/>
+      <w:r>
+        <w:t>doku</w:t>
+      </w:r>
+      <w:proofErr w:type="spellEnd"/>
+      <w:r>
+        <w:t xml:space="preserve"> módosítás</w:t>
+      </w:r>
+    </w:p>
+    <w:p>
+      <w:pPr>
+        <w:numPr>
+          <w:ilvl w:val="0"/>
+          <w:numId w:val="2"/>
+        </w:numPr>
+      </w:pPr>
+      <w:proofErr w:type="spellStart"/>
+      <w:r>
+        <w:t>sidebar</w:t>
+      </w:r>
+      <w:proofErr w:type="spellEnd"/>
+      <w:r>
+        <w:t xml:space="preserve">-ban szereplő dolgok kezelését felírni a </w:t>
+      </w:r>
+      <w:proofErr w:type="spellStart"/>
+      <w:r>
+        <w:t>dokuba</w:t>
+      </w:r>
+      <w:proofErr w:type="spellEnd"/>
+    </w:p>
+    <w:p>
+      <w:pPr>
+        <w:numPr>
+          <w:ilvl w:val="0"/>
+          <w:numId w:val="2"/>
+        </w:numPr>
+      </w:pPr>
+      <w:r>
+        <w:t xml:space="preserve">1. foglalás a </w:t>
+      </w:r>
+      <w:proofErr w:type="spellStart"/>
+      <w:r>
+        <w:t>database</w:t>
+      </w:r>
+      <w:proofErr w:type="spellEnd"/>
+      <w:r>
+        <w:t>-ben és eszerint kaphat kedvezményt.</w:t>
+      </w:r>
+      <w:r>
+        <w:t xml:space="preserve"> - </w:t>
+      </w:r>
+      <w:proofErr w:type="spellStart"/>
+      <w:r>
+        <w:t>dokuba</w:t>
+      </w:r>
+      <w:proofErr w:type="spellEnd"/>
+    </w:p>
+    <w:p>
+      <w:pPr>
+        <w:numPr>
+          <w:ilvl w:val="0"/>
+          <w:numId w:val="2"/>
+        </w:numPr>
+      </w:pPr>
+      <w:proofErr w:type="spellStart"/>
       <w:r>
         <w:lastRenderedPageBreak/>
-        <w:t>url-be bejelentkezés nélkül ne lehessen beírni az admin url-t. bármelyiket is. mind protected legyen. + 404 oldal kell</w:t>
-      </w:r>
-      <w:r>
-        <w:t xml:space="preserve"> - dokuba</w:t>
-      </w:r>
-    </w:p>
-    <w:p>
-      <w:pPr>
-        <w:numPr>
-          <w:ilvl w:val="0"/>
-          <w:numId w:val="2"/>
-        </w:numPr>
-      </w:pPr>
-      <w:r>
-        <w:t>booking táblába belerakni a teljes vásárlási összeget – dokuba is</w:t>
-      </w:r>
-    </w:p>
-    <w:p>
-      <w:pPr>
-        <w:numPr>
-          <w:ilvl w:val="0"/>
-          <w:numId w:val="2"/>
-        </w:numPr>
-      </w:pPr>
-      <w:r>
-        <w:t>értékelések átlagja az adminon , a room és a home oldalon a kártyákon megjelenik. – dokuba</w:t>
-      </w:r>
-    </w:p>
-    <w:p>
-      <w:pPr>
-        <w:numPr>
-          <w:ilvl w:val="0"/>
-          <w:numId w:val="2"/>
-        </w:numPr>
-      </w:pPr>
-      <w:r>
-        <w:t>az értesítések (pl. megerősítések) nem alert-ben, hanem rendes message boxban jelennek meg. - dokuba</w:t>
-      </w:r>
-    </w:p>
-    <w:p>
-      <w:pPr>
-        <w:numPr>
-          <w:ilvl w:val="0"/>
-          <w:numId w:val="2"/>
-        </w:numPr>
-      </w:pPr>
-      <w:r>
-        <w:t>amit az admin nem látott még értékelés vagy foglalás, az a sidebar-on piros körben jelzett szám notification-ként jelenik meg – dokuba</w:t>
-      </w:r>
-    </w:p>
-    <w:p>
-      <w:pPr>
-        <w:numPr>
-          <w:ilvl w:val="0"/>
-          <w:numId w:val="2"/>
-        </w:numPr>
-      </w:pPr>
-      <w:r>
-        <w:t>server.js szétbontása 6 fájlra: A server.js elindítja az egész Express‑alkalmazást, beállítja a JSON‑feldolgozást, a CORS‑t és a statikus fájlok kiszolgálását, majd átadja a vezérlést a route‑oknak. A routes.js összeköti az URL‑végpontokat a megfelelő vezérlőfüggvényekkel, vagyis meghatározza, hogy egy adott HTTP kérés melyik logikát futtassa. A middleware.js gondoskodik a belépett felhasználó azonosításáról JWT token alapján, és ellenőrzi, hogy valaki rendelkezik‑e admin jogosultsággal, mielőtt engedné bizonyos műveletek végrehajtását. A utils.js olyan segédfunkciókat tartalmaz, mint a fájlfeltöltés konfigurációja, az ID‑ellenőrzés és a képek adatbázisból való normalizálása, amelyeket több helyen is újra felhasznál a rendszer. A controllers.js kezeli az összes üzleti logikát — regisztrációt, bejelentkezést, szobák és foglalások CRUD műveleteit, értékeléseket és a felhasználói fiókhoz tartozó adatkezelést — az email‑küldés kivételével. Az email.js kizárólag az email‑küldéssel kapcsolatos feladatokat végzi, például a jelszó‑visszaállító link kiküldését és a kapcsolatfelvételi űrlap továbbítását, külön kezelve a többi logikától. - dokuba</w:t>
-      </w:r>
-    </w:p>
-    <w:p>
-      <w:pPr>
-        <w:numPr>
-          <w:ilvl w:val="0"/>
-          <w:numId w:val="2"/>
-        </w:numPr>
-      </w:pPr>
-      <w:r>
-        <w:t>a véleményt csak akkor tudjon majd írni, ha volt is biztosan ott volt, tehát ahhoz a szobához jóvá volt hagyva - dokuba</w:t>
-      </w:r>
-    </w:p>
-    <w:p>
-      <w:pPr>
-        <w:numPr>
-          <w:ilvl w:val="0"/>
-          <w:numId w:val="2"/>
-        </w:numPr>
-      </w:pPr>
-      <w:r>
-        <w:t>a szűrés biztos működik? leelenőrzi, hogy melyik foglalt? és visszafelé nem lehet keresni - dokuba</w:t>
-      </w:r>
-    </w:p>
-    <w:p>
-      <w:pPr>
-        <w:numPr>
-          <w:ilvl w:val="0"/>
-          <w:numId w:val="2"/>
-        </w:numPr>
-      </w:pPr>
-      <w:r>
-        <w:t>Foglaláskor ha nincs bejelentkezve és bejelentkezik, megjegyzi a beállításokat és visszairányít vagy ha elkattint akkor is - dokuba</w:t>
-      </w:r>
-    </w:p>
-    <w:p>
-      <w:pPr>
-        <w:numPr>
-          <w:ilvl w:val="0"/>
-          <w:numId w:val="2"/>
-        </w:numPr>
-      </w:pPr>
-      <w:r>
-        <w:t>regisztrációnál datepicker és ellenőrzés, hogy olyan formátban van, mindenfajta hibához korrekt érthető visszajelzést ír alulra pirossal - dokuba</w:t>
-      </w:r>
-    </w:p>
-    <w:p>
-      <w:pPr>
-        <w:numPr>
-          <w:ilvl w:val="0"/>
-          <w:numId w:val="2"/>
-        </w:numPr>
-      </w:pPr>
-      <w:r>
-        <w:t>felhasználó beállítások, miket foglalt, kezelés, stb</w:t>
-      </w:r>
+        <w:t>url-be</w:t>
+      </w:r>
+      <w:proofErr w:type="spellEnd"/>
+      <w:r>
+        <w:t xml:space="preserve"> bejelentkezés nélkül ne lehessen beírni az </w:t>
+      </w:r>
+      <w:proofErr w:type="spellStart"/>
+      <w:r>
+        <w:t>admin</w:t>
+      </w:r>
+      <w:proofErr w:type="spellEnd"/>
       <w:r>
         <w:t xml:space="preserve"> </w:t>
       </w:r>
+      <w:proofErr w:type="spellStart"/>
+      <w:r>
+        <w:t>url-t</w:t>
+      </w:r>
+      <w:proofErr w:type="spellEnd"/>
+      <w:r>
+        <w:t xml:space="preserve">. bármelyiket is. mind </w:t>
+      </w:r>
+      <w:proofErr w:type="spellStart"/>
+      <w:r>
+        <w:t>protected</w:t>
+      </w:r>
+      <w:proofErr w:type="spellEnd"/>
+      <w:r>
+        <w:t xml:space="preserve"> legyen. + 404 oldal kell</w:t>
+      </w:r>
+      <w:r>
+        <w:t xml:space="preserve"> - </w:t>
+      </w:r>
+      <w:proofErr w:type="spellStart"/>
+      <w:r>
+        <w:t>dokuba</w:t>
+      </w:r>
+      <w:proofErr w:type="spellEnd"/>
+    </w:p>
+    <w:p>
+      <w:pPr>
+        <w:numPr>
+          <w:ilvl w:val="0"/>
+          <w:numId w:val="2"/>
+        </w:numPr>
+      </w:pPr>
+      <w:proofErr w:type="spellStart"/>
+      <w:r>
+        <w:t>booking</w:t>
+      </w:r>
+      <w:proofErr w:type="spellEnd"/>
+      <w:r>
+        <w:t xml:space="preserve"> táblába belerakni a teljes vásárlási összeget – </w:t>
+      </w:r>
+      <w:proofErr w:type="spellStart"/>
+      <w:r>
+        <w:t>dokuba</w:t>
+      </w:r>
+      <w:proofErr w:type="spellEnd"/>
+      <w:r>
+        <w:t xml:space="preserve"> is</w:t>
+      </w:r>
+    </w:p>
+    <w:p>
+      <w:pPr>
+        <w:numPr>
+          <w:ilvl w:val="0"/>
+          <w:numId w:val="2"/>
+        </w:numPr>
+      </w:pPr>
+      <w:r>
+        <w:t xml:space="preserve">értékelések </w:t>
+      </w:r>
+      <w:proofErr w:type="spellStart"/>
+      <w:r>
+        <w:t>átlagja</w:t>
+      </w:r>
+      <w:proofErr w:type="spellEnd"/>
+      <w:r>
+        <w:t xml:space="preserve"> az </w:t>
+      </w:r>
+      <w:proofErr w:type="spellStart"/>
+      <w:r>
+        <w:t>adminon</w:t>
+      </w:r>
+      <w:proofErr w:type="spellEnd"/>
+      <w:r>
+        <w:t xml:space="preserve"> , a </w:t>
+      </w:r>
+      <w:proofErr w:type="spellStart"/>
+      <w:r>
+        <w:t>room</w:t>
+      </w:r>
+      <w:proofErr w:type="spellEnd"/>
+      <w:r>
+        <w:t xml:space="preserve"> és a </w:t>
+      </w:r>
+      <w:proofErr w:type="spellStart"/>
+      <w:r>
+        <w:t>home</w:t>
+      </w:r>
+      <w:proofErr w:type="spellEnd"/>
+      <w:r>
+        <w:t xml:space="preserve"> oldalon a kártyákon megjelenik. – </w:t>
+      </w:r>
+      <w:proofErr w:type="spellStart"/>
+      <w:r>
+        <w:t>dokuba</w:t>
+      </w:r>
+      <w:proofErr w:type="spellEnd"/>
+    </w:p>
+    <w:p>
+      <w:pPr>
+        <w:numPr>
+          <w:ilvl w:val="0"/>
+          <w:numId w:val="2"/>
+        </w:numPr>
+      </w:pPr>
+      <w:r>
+        <w:t xml:space="preserve">az értesítések (pl. megerősítések) nem </w:t>
+      </w:r>
+      <w:proofErr w:type="spellStart"/>
+      <w:r>
+        <w:t>alert</w:t>
+      </w:r>
+      <w:proofErr w:type="spellEnd"/>
+      <w:r>
+        <w:t xml:space="preserve">-ben, hanem rendes </w:t>
+      </w:r>
+      <w:proofErr w:type="spellStart"/>
+      <w:r>
+        <w:t>message</w:t>
+      </w:r>
+      <w:proofErr w:type="spellEnd"/>
+      <w:r>
+        <w:t xml:space="preserve"> </w:t>
+      </w:r>
+      <w:proofErr w:type="spellStart"/>
+      <w:r>
+        <w:t>boxban</w:t>
+      </w:r>
+      <w:proofErr w:type="spellEnd"/>
+      <w:r>
+        <w:t xml:space="preserve"> jelennek meg. - </w:t>
+      </w:r>
+      <w:proofErr w:type="spellStart"/>
+      <w:r>
+        <w:t>dokuba</w:t>
+      </w:r>
+      <w:proofErr w:type="spellEnd"/>
+    </w:p>
+    <w:p>
+      <w:pPr>
+        <w:numPr>
+          <w:ilvl w:val="0"/>
+          <w:numId w:val="2"/>
+        </w:numPr>
+      </w:pPr>
+      <w:r>
+        <w:t xml:space="preserve">amit az </w:t>
+      </w:r>
+      <w:proofErr w:type="spellStart"/>
+      <w:r>
+        <w:t>admin</w:t>
+      </w:r>
+      <w:proofErr w:type="spellEnd"/>
+      <w:r>
+        <w:t xml:space="preserve"> nem látott még értékelés vagy foglalás, az a </w:t>
+      </w:r>
+      <w:proofErr w:type="spellStart"/>
+      <w:r>
+        <w:t>sidebar-on</w:t>
+      </w:r>
+      <w:proofErr w:type="spellEnd"/>
+      <w:r>
+        <w:t xml:space="preserve"> piros körben jelzett szám </w:t>
+      </w:r>
+      <w:proofErr w:type="spellStart"/>
+      <w:r>
+        <w:t>notification</w:t>
+      </w:r>
+      <w:proofErr w:type="spellEnd"/>
+      <w:r>
+        <w:t xml:space="preserve">-ként jelenik meg – </w:t>
+      </w:r>
+      <w:proofErr w:type="spellStart"/>
+      <w:r>
+        <w:t>dokuba</w:t>
+      </w:r>
+      <w:proofErr w:type="spellEnd"/>
+    </w:p>
+    <w:p>
+      <w:pPr>
+        <w:numPr>
+          <w:ilvl w:val="0"/>
+          <w:numId w:val="2"/>
+        </w:numPr>
+      </w:pPr>
+      <w:r>
+        <w:t xml:space="preserve">server.js szétbontása 6 fájlra: A server.js elindítja az egész Express‑alkalmazást, beállítja a JSON‑feldolgozást, a CORS‑t és a statikus fájlok kiszolgálását, majd átadja a vezérlést a </w:t>
+      </w:r>
+      <w:proofErr w:type="spellStart"/>
+      <w:r>
+        <w:t>route</w:t>
+      </w:r>
+      <w:proofErr w:type="spellEnd"/>
+      <w:r>
+        <w:t xml:space="preserve">‑oknak. A routes.js összeköti az URL‑végpontokat a megfelelő vezérlőfüggvényekkel, vagyis meghatározza, hogy egy adott HTTP kérés melyik logikát futtassa. A middleware.js gondoskodik a belépett felhasználó azonosításáról JWT </w:t>
+      </w:r>
+      <w:proofErr w:type="spellStart"/>
+      <w:r>
+        <w:t>token</w:t>
+      </w:r>
+      <w:proofErr w:type="spellEnd"/>
+      <w:r>
+        <w:t xml:space="preserve"> alapján, és ellenőrzi, hogy valaki rendelkezik‑e </w:t>
+      </w:r>
+      <w:proofErr w:type="spellStart"/>
+      <w:r>
+        <w:t>admin</w:t>
+      </w:r>
+      <w:proofErr w:type="spellEnd"/>
+      <w:r>
+        <w:t xml:space="preserve"> jogosultsággal, mielőtt engedné bizonyos műveletek végrehajtását. A utils.js olyan segédfunkciókat tartalmaz, mint a fájlfeltöltés konfigurációja, az ID‑ellenőrzés és a képek adatbázisból való normalizálása, amelyeket több helyen is újra felhasznál a rendszer. A controllers.js kezeli az összes üzleti logikát — regisztrációt, bejelentkezést, szobák és foglalások CRUD műveleteit, értékeléseket és a felhasználói fiókhoz tartozó adatkezelést — az email‑küldés kivételével. Az email.js kizárólag az email‑küldéssel kapcsolatos feladatokat végzi, például a jelszó‑visszaállító link kiküldését és a kapcsolatfelvételi űrlap továbbítását, külön kezelve a többi logikától. - </w:t>
+      </w:r>
+      <w:proofErr w:type="spellStart"/>
+      <w:r>
+        <w:t>dokuba</w:t>
+      </w:r>
+      <w:proofErr w:type="spellEnd"/>
+    </w:p>
+    <w:p>
+      <w:pPr>
+        <w:numPr>
+          <w:ilvl w:val="0"/>
+          <w:numId w:val="2"/>
+        </w:numPr>
+      </w:pPr>
+      <w:r>
+        <w:t xml:space="preserve">a véleményt csak akkor tudjon majd írni, ha volt is biztosan ott volt, tehát ahhoz a szobához jóvá volt hagyva - </w:t>
+      </w:r>
+      <w:proofErr w:type="spellStart"/>
+      <w:r>
+        <w:t>dokuba</w:t>
+      </w:r>
+      <w:proofErr w:type="spellEnd"/>
+    </w:p>
+    <w:p>
+      <w:pPr>
+        <w:numPr>
+          <w:ilvl w:val="0"/>
+          <w:numId w:val="2"/>
+        </w:numPr>
+      </w:pPr>
+      <w:r>
+        <w:t xml:space="preserve">a szűrés biztos működik? </w:t>
+      </w:r>
+      <w:proofErr w:type="spellStart"/>
+      <w:r>
+        <w:t>leelenőrzi</w:t>
+      </w:r>
+      <w:proofErr w:type="spellEnd"/>
+      <w:r>
+        <w:t xml:space="preserve">, hogy melyik foglalt? és visszafelé nem lehet keresni - </w:t>
+      </w:r>
+      <w:proofErr w:type="spellStart"/>
+      <w:r>
+        <w:t>dokuba</w:t>
+      </w:r>
+      <w:proofErr w:type="spellEnd"/>
+    </w:p>
+    <w:p>
+      <w:pPr>
+        <w:numPr>
+          <w:ilvl w:val="0"/>
+          <w:numId w:val="2"/>
+        </w:numPr>
+      </w:pPr>
+      <w:r>
+        <w:t xml:space="preserve">Foglaláskor ha nincs bejelentkezve és bejelentkezik, megjegyzi a beállításokat és visszairányít vagy ha elkattint akkor is - </w:t>
+      </w:r>
+      <w:proofErr w:type="spellStart"/>
+      <w:r>
+        <w:t>dokuba</w:t>
+      </w:r>
+      <w:proofErr w:type="spellEnd"/>
+    </w:p>
+    <w:p>
+      <w:pPr>
+        <w:numPr>
+          <w:ilvl w:val="0"/>
+          <w:numId w:val="2"/>
+        </w:numPr>
+      </w:pPr>
+      <w:r>
+        <w:t xml:space="preserve">regisztrációnál </w:t>
+      </w:r>
+      <w:proofErr w:type="spellStart"/>
+      <w:r>
+        <w:t>datepicker</w:t>
+      </w:r>
+      <w:proofErr w:type="spellEnd"/>
+      <w:r>
+        <w:t xml:space="preserve"> és ellenőrzés, hogy olyan </w:t>
+      </w:r>
+      <w:proofErr w:type="spellStart"/>
+      <w:r>
+        <w:t>formátban</w:t>
+      </w:r>
+      <w:proofErr w:type="spellEnd"/>
+      <w:r>
+        <w:t xml:space="preserve"> van, mindenfajta hibához korrekt érthető visszajelzést ír alulra pirossal - </w:t>
+      </w:r>
+      <w:proofErr w:type="spellStart"/>
+      <w:r>
+        <w:t>dokuba</w:t>
+      </w:r>
+      <w:proofErr w:type="spellEnd"/>
+    </w:p>
+    <w:p>
+      <w:pPr>
+        <w:numPr>
+          <w:ilvl w:val="0"/>
+          <w:numId w:val="2"/>
+        </w:numPr>
+      </w:pPr>
+      <w:r>
+        <w:t xml:space="preserve">felhasználó beállítások, miket foglalt, kezelés, </w:t>
+      </w:r>
+      <w:proofErr w:type="spellStart"/>
+      <w:r>
+        <w:t>stb</w:t>
+      </w:r>
+      <w:proofErr w:type="spellEnd"/>
+      <w:r>
+        <w:t xml:space="preserve"> </w:t>
+      </w:r>
       <w:r>
         <w:t>–</w:t>
       </w:r>
       <w:r>
-        <w:t xml:space="preserve"> dokuba</w:t>
-      </w:r>
-    </w:p>
-    <w:p>
-      <w:pPr>
-        <w:numPr>
-          <w:ilvl w:val="0"/>
-          <w:numId w:val="2"/>
-        </w:numPr>
-      </w:pPr>
-      <w:r>
-        <w:t xml:space="preserve">kategória kezelés: home, admin </w:t>
-      </w:r>
-      <w:r>
-        <w:t>–</w:t>
-      </w:r>
-      <w:r>
-        <w:t xml:space="preserve"> dokuba</w:t>
-      </w:r>
-    </w:p>
-    <w:p>
-      <w:pPr>
-        <w:numPr>
-          <w:ilvl w:val="0"/>
-          <w:numId w:val="2"/>
-        </w:numPr>
-      </w:pPr>
-      <w:r>
-        <w:t xml:space="preserve">regisztráció bejelentkezés oldal dizájnhoz hasonló, elfogadja az ászf-et és az adatkezelést + visszaigazoló e-mail (tehát nem automata, így biztonságos és profi, életszerű, a regisztráció gomb egy tokent generál amit majd a felhasználó az emailben kapott kóddal validál) </w:t>
-      </w:r>
-      <w:r>
-        <w:t>–</w:t>
-      </w:r>
-      <w:r>
-        <w:t xml:space="preserve"> dokuba</w:t>
-      </w:r>
+        <w:t xml:space="preserve"> </w:t>
+      </w:r>
+      <w:proofErr w:type="spellStart"/>
+      <w:r>
+        <w:t>dokuba</w:t>
+      </w:r>
+      <w:proofErr w:type="spellEnd"/>
+    </w:p>
+    <w:p>
+      <w:pPr>
+        <w:numPr>
+          <w:ilvl w:val="0"/>
+          <w:numId w:val="2"/>
+        </w:numPr>
+      </w:pPr>
+      <w:r>
+        <w:t xml:space="preserve">kategória kezelés: </w:t>
+      </w:r>
+      <w:proofErr w:type="spellStart"/>
+      <w:r>
+        <w:t>home</w:t>
+      </w:r>
+      <w:proofErr w:type="spellEnd"/>
+      <w:r>
+        <w:t xml:space="preserve">, </w:t>
+      </w:r>
+      <w:proofErr w:type="spellStart"/>
+      <w:r>
+        <w:t>admin</w:t>
+      </w:r>
+      <w:proofErr w:type="spellEnd"/>
+      <w:r>
+        <w:t xml:space="preserve"> – </w:t>
+      </w:r>
+      <w:proofErr w:type="spellStart"/>
+      <w:r>
+        <w:t>dokuba</w:t>
+      </w:r>
+      <w:proofErr w:type="spellEnd"/>
+    </w:p>
+    <w:p>
+      <w:pPr>
+        <w:numPr>
+          <w:ilvl w:val="0"/>
+          <w:numId w:val="2"/>
+        </w:numPr>
+      </w:pPr>
+      <w:r>
+        <w:t xml:space="preserve">regisztráció bejelentkezés oldal dizájnhoz hasonló, elfogadja az </w:t>
+      </w:r>
+      <w:proofErr w:type="spellStart"/>
+      <w:r>
+        <w:t>ászf-et</w:t>
+      </w:r>
+      <w:proofErr w:type="spellEnd"/>
+      <w:r>
+        <w:t xml:space="preserve"> és az adatkezelést + visszaigazoló e-mail (tehát nem automata, így biztonságos és profi, életszerű, a regisztráció gomb egy </w:t>
+      </w:r>
+      <w:proofErr w:type="spellStart"/>
+      <w:r>
+        <w:t>tokent</w:t>
+      </w:r>
+      <w:proofErr w:type="spellEnd"/>
+      <w:r>
+        <w:t xml:space="preserve"> generál amit majd a felhasználó az emailben kapott kóddal </w:t>
+      </w:r>
+      <w:proofErr w:type="spellStart"/>
+      <w:r>
+        <w:t>validál</w:t>
+      </w:r>
+      <w:proofErr w:type="spellEnd"/>
+      <w:r>
+        <w:t xml:space="preserve">) – </w:t>
+      </w:r>
+      <w:proofErr w:type="spellStart"/>
+      <w:r>
+        <w:t>dokuba</w:t>
+      </w:r>
+      <w:proofErr w:type="spellEnd"/>
     </w:p>
     <w:p>
       <w:pPr>
@@ -468,19 +1158,13 @@
         <w:spacing w:after="0"/>
       </w:pPr>
       <w:r>
-        <w:t>legutóbbi adatbázist kell mindenhova írni - dokuba</w:t>
-      </w:r>
-    </w:p>
-    <w:p>
-      <w:pPr>
-        <w:numPr>
-          <w:ilvl w:val="0"/>
-          <w:numId w:val="2"/>
-        </w:numPr>
-      </w:pPr>
-      <w:r>
-        <w:t>booking tábla összeg legyen benne és az admin-on is írja oda a foglalás összegét + ne id-kat, hanem felhasználóneveket írjon meg szobaneveket</w:t>
-      </w:r>
+        <w:t xml:space="preserve">legutóbbi adatbázist kell mindenhova írni - </w:t>
+      </w:r>
+      <w:proofErr w:type="spellStart"/>
+      <w:r>
+        <w:t>dokuba</w:t>
+      </w:r>
+      <w:proofErr w:type="spellEnd"/>
     </w:p>
     <w:p>
       <w:pPr>
@@ -503,20 +1187,13 @@
           <w:numId w:val="2"/>
         </w:numPr>
       </w:pPr>
-      <w:r>
-        <w:lastRenderedPageBreak/>
-        <w:t>nodemailer (emailek mindenhez, adatmódosításhoz is, persze adatok nélkül)</w:t>
-      </w:r>
-    </w:p>
-    <w:p>
-      <w:pPr>
-        <w:numPr>
-          <w:ilvl w:val="0"/>
-          <w:numId w:val="2"/>
-        </w:numPr>
-      </w:pPr>
-      <w:r>
-        <w:t>admin oldal visszajelzés, hogy mit kell feltölteni, nem csak hiba</w:t>
+      <w:proofErr w:type="spellStart"/>
+      <w:r>
+        <w:t>admin</w:t>
+      </w:r>
+      <w:proofErr w:type="spellEnd"/>
+      <w:r>
+        <w:t xml:space="preserve"> oldal visszajelzés, hogy mit kell feltölteni, nem csak hiba</w:t>
       </w:r>
     </w:p>
     <w:p>
@@ -534,11 +1211,65 @@
         </w:pBdr>
       </w:pPr>
       <w:r>
-        <w:t>a room és kategóriánál az url-ben ne id, hanem név legyen, tehát nem /rooms/1, hanem rooms/valami_szoba (vagy akár magyarosítani)</w:t>
-      </w:r>
-      <w:r>
-        <w:t xml:space="preserve"> – kész - dokuba</w:t>
-      </w:r>
+        <w:lastRenderedPageBreak/>
+        <w:t xml:space="preserve">a </w:t>
+      </w:r>
+      <w:proofErr w:type="spellStart"/>
+      <w:r>
+        <w:t>room</w:t>
+      </w:r>
+      <w:proofErr w:type="spellEnd"/>
+      <w:r>
+        <w:t xml:space="preserve"> és kategóriánál az </w:t>
+      </w:r>
+      <w:proofErr w:type="spellStart"/>
+      <w:r>
+        <w:t>url-ben</w:t>
+      </w:r>
+      <w:proofErr w:type="spellEnd"/>
+      <w:r>
+        <w:t xml:space="preserve"> ne </w:t>
+      </w:r>
+      <w:proofErr w:type="spellStart"/>
+      <w:r>
+        <w:t>id</w:t>
+      </w:r>
+      <w:proofErr w:type="spellEnd"/>
+      <w:r>
+        <w:t>, hanem név legyen, tehát nem /</w:t>
+      </w:r>
+      <w:proofErr w:type="spellStart"/>
+      <w:r>
+        <w:t>rooms</w:t>
+      </w:r>
+      <w:proofErr w:type="spellEnd"/>
+      <w:r>
+        <w:t xml:space="preserve">/1, hanem </w:t>
+      </w:r>
+      <w:proofErr w:type="spellStart"/>
+      <w:r>
+        <w:t>rooms</w:t>
+      </w:r>
+      <w:proofErr w:type="spellEnd"/>
+      <w:r>
+        <w:t>/</w:t>
+      </w:r>
+      <w:proofErr w:type="spellStart"/>
+      <w:r>
+        <w:t>valami_szoba</w:t>
+      </w:r>
+      <w:proofErr w:type="spellEnd"/>
+      <w:r>
+        <w:t xml:space="preserve"> (vagy akár magyarosítani)</w:t>
+      </w:r>
+      <w:r>
+        <w:t xml:space="preserve"> – kész - </w:t>
+      </w:r>
+      <w:proofErr w:type="spellStart"/>
+      <w:r>
+        <w:t>dokuba</w:t>
+      </w:r>
+      <w:proofErr w:type="spellEnd"/>
     </w:p>
     <w:p>
       <w:pPr>
@@ -549,14 +1280,33 @@
         <w:spacing w:after="0"/>
       </w:pPr>
       <w:r>
-        <w:t xml:space="preserve">adminkezeles oldalon </w:t>
-      </w:r>
-      <w:r>
-        <w:t xml:space="preserve"> kategória hozzáadása link, és redirect</w:t>
-      </w:r>
-    </w:p>
-    <w:p>
-      <w:pPr>
+        <w:t xml:space="preserve">a foglalás időtartama, a két dátum ne legyen </w:t>
+      </w:r>
+      <w:proofErr w:type="spellStart"/>
+      <w:r>
+        <w:t>datetime</w:t>
+      </w:r>
+      <w:proofErr w:type="spellEnd"/>
+      <w:r>
+        <w:t xml:space="preserve">, hanem csak </w:t>
+      </w:r>
+      <w:proofErr w:type="spellStart"/>
+      <w:r>
+        <w:t>date</w:t>
+      </w:r>
+      <w:proofErr w:type="spellEnd"/>
+      <w:r>
+        <w:t xml:space="preserve">, mert így hajnali 2 óra van megadva az </w:t>
+      </w:r>
+      <w:proofErr w:type="spellStart"/>
+      <w:r>
+        <w:t>adminon</w:t>
+      </w:r>
+      <w:proofErr w:type="spellEnd"/>
+    </w:p>
+    <w:p>
+      <w:pPr>
+        <w:pStyle w:val="Listaszerbekezds"/>
         <w:numPr>
           <w:ilvl w:val="0"/>
           <w:numId w:val="1"/>
@@ -564,7 +1314,34 @@
         <w:spacing w:after="0"/>
       </w:pPr>
       <w:r>
-        <w:t>a foglalás időtartama, a két dátum ne legyen datetime, hanem csak date, mert így hajnali 2 óra van megadva az adminon</w:t>
+        <w:t>a r</w:t>
+      </w:r>
+      <w:proofErr w:type="spellStart"/>
+      <w:r>
+        <w:t>oom</w:t>
+      </w:r>
+      <w:proofErr w:type="spellEnd"/>
+      <w:r>
+        <w:t xml:space="preserve"> foglalás utáni </w:t>
+      </w:r>
+      <w:proofErr w:type="spellStart"/>
+      <w:r>
+        <w:t>confirmationban</w:t>
+      </w:r>
+      <w:proofErr w:type="spellEnd"/>
+      <w:r>
+        <w:t xml:space="preserve"> legyen benne, hogy hova utaljon és mennyit és mi a foglalás száma (</w:t>
+      </w:r>
+      <w:proofErr w:type="spellStart"/>
+      <w:r>
+        <w:t>id</w:t>
+      </w:r>
+      <w:proofErr w:type="spellEnd"/>
+      <w:r>
+        <w:t>, amit az emailben is ír)</w:t>
+      </w:r>
+      <w:r>
+        <w:t xml:space="preserve"> + az legyen a szöveg, hogy köszönjük a foglalást</w:t>
       </w:r>
     </w:p>
     <w:p>
@@ -573,244 +1350,222 @@
           <w:ilvl w:val="0"/>
           <w:numId w:val="1"/>
         </w:numPr>
+      </w:pPr>
+      <w:r>
+        <w:t>saját kezelés legyen dátum melyiket mikor foglalta</w:t>
+      </w:r>
+      <w:r>
+        <w:t xml:space="preserve"> + adatmódosításnál új jelszó megerősítése</w:t>
+      </w:r>
+      <w:r>
+        <w:t xml:space="preserve"> </w:t>
+      </w:r>
+    </w:p>
+    <w:p>
+      <w:pPr>
+        <w:numPr>
+          <w:ilvl w:val="0"/>
+          <w:numId w:val="1"/>
+        </w:numPr>
+      </w:pPr>
+      <w:r>
+        <w:t xml:space="preserve">a </w:t>
+      </w:r>
+      <w:proofErr w:type="spellStart"/>
+      <w:r>
+        <w:t>room</w:t>
+      </w:r>
+      <w:proofErr w:type="spellEnd"/>
+      <w:r>
+        <w:t xml:space="preserve"> oldalon, amikor a foglalást leadom és még nem jött be az oldal, akkor ne jelenjen meg sárga üzenetként a </w:t>
+      </w:r>
+      <w:proofErr w:type="spellStart"/>
+      <w:r>
+        <w:t>room</w:t>
+      </w:r>
+      <w:proofErr w:type="spellEnd"/>
+      <w:r>
+        <w:t xml:space="preserve"> oldalon, hogy már van ott függő foglalás</w:t>
+      </w:r>
+    </w:p>
+    <w:p>
+      <w:pPr>
+        <w:numPr>
+          <w:ilvl w:val="0"/>
+          <w:numId w:val="1"/>
+        </w:numPr>
+      </w:pPr>
+      <w:proofErr w:type="spellStart"/>
+      <w:r>
+        <w:t>admin</w:t>
+      </w:r>
+      <w:proofErr w:type="spellEnd"/>
+      <w:r>
+        <w:t xml:space="preserve"> foglalások oldalon ne </w:t>
+      </w:r>
+      <w:proofErr w:type="spellStart"/>
+      <w:r>
+        <w:t>id-kat</w:t>
+      </w:r>
+      <w:proofErr w:type="spellEnd"/>
+      <w:r>
+        <w:t xml:space="preserve"> írjon ki és ne legyen frissítés gomb meg vissza a szobákhoz se legyen</w:t>
+      </w:r>
+      <w:r>
+        <w:t xml:space="preserve"> + ne férőhelyet, mert nem az, hanem, hogy vendégek száma</w:t>
+      </w:r>
+    </w:p>
+    <w:p>
+      <w:pPr>
+        <w:numPr>
+          <w:ilvl w:val="0"/>
+          <w:numId w:val="1"/>
+        </w:numPr>
+      </w:pPr>
+      <w:r>
+        <w:t>regisztráció oldalon az email küldve zöld üzenet lent legyen, ne fent</w:t>
+      </w:r>
+    </w:p>
+    <w:p>
+      <w:pPr>
+        <w:numPr>
+          <w:ilvl w:val="0"/>
+          <w:numId w:val="1"/>
+        </w:numPr>
+      </w:pPr>
+      <w:proofErr w:type="spellStart"/>
+      <w:r>
+        <w:t>alertek</w:t>
+      </w:r>
+      <w:proofErr w:type="spellEnd"/>
+      <w:r>
+        <w:t xml:space="preserve"> helyett rendes üzenetek</w:t>
+      </w:r>
+      <w:r>
+        <w:t xml:space="preserve"> középen</w:t>
+      </w:r>
+      <w:r>
+        <w:t xml:space="preserve"> és kuka gombok a kártyák jobb felső sarkában az </w:t>
+      </w:r>
+      <w:proofErr w:type="spellStart"/>
+      <w:r>
+        <w:t>adminon</w:t>
+      </w:r>
+      <w:proofErr w:type="spellEnd"/>
+    </w:p>
+    <w:p>
+      <w:pPr>
+        <w:numPr>
+          <w:ilvl w:val="0"/>
+          <w:numId w:val="1"/>
+        </w:numPr>
+      </w:pPr>
+      <w:proofErr w:type="spellStart"/>
+      <w:r>
+        <w:t>admin</w:t>
+      </w:r>
+      <w:proofErr w:type="spellEnd"/>
+      <w:r>
+        <w:t xml:space="preserve"> </w:t>
+      </w:r>
+      <w:proofErr w:type="spellStart"/>
+      <w:r>
+        <w:t>sidebaron</w:t>
+      </w:r>
+      <w:proofErr w:type="spellEnd"/>
+      <w:r>
+        <w:t xml:space="preserve"> a foglalást nem jelzi</w:t>
+      </w:r>
+      <w:r>
+        <w:t>, a jóváhagyásra várók számát kéne mindig kiírnia, így nincs baj a session problémával</w:t>
+      </w:r>
+      <w:r>
+        <w:t>, ha bejön új és ha új session van, kiírja a felhasználóknál a piros karikában a számot, hogy vannak újak, pedig csak új session van, meg nem is kéne ott lennie, mert irreleváns</w:t>
+      </w:r>
+      <w:r>
+        <w:t xml:space="preserve"> + a frissítés gomb ne legyen</w:t>
+      </w:r>
+      <w:r>
+        <w:t xml:space="preserve"> + felhasználó </w:t>
+      </w:r>
+      <w:proofErr w:type="spellStart"/>
+      <w:r>
+        <w:t>modifykor</w:t>
+      </w:r>
+      <w:proofErr w:type="spellEnd"/>
+      <w:r>
+        <w:t xml:space="preserve"> is legyen </w:t>
+      </w:r>
+      <w:proofErr w:type="spellStart"/>
+      <w:r>
+        <w:t>id</w:t>
+      </w:r>
+      <w:proofErr w:type="spellEnd"/>
+    </w:p>
+    <w:p>
+      <w:pPr>
+        <w:pStyle w:val="Listaszerbekezds"/>
+        <w:numPr>
+          <w:ilvl w:val="0"/>
+          <w:numId w:val="2"/>
+        </w:numPr>
         <w:spacing w:after="0"/>
       </w:pPr>
       <w:r>
-        <w:t>a login és regisztráció videó vízjelének eltüntetése</w:t>
-      </w:r>
-    </w:p>
-    <w:p>
-      <w:pPr>
-        <w:pStyle w:val="Listaszerbekezds"/>
-        <w:numPr>
-          <w:ilvl w:val="0"/>
-          <w:numId w:val="1"/>
-        </w:numPr>
+        <w:t xml:space="preserve">a </w:t>
+      </w:r>
+      <w:proofErr w:type="spellStart"/>
+      <w:r>
+        <w:t>room-nál</w:t>
+      </w:r>
+      <w:proofErr w:type="spellEnd"/>
+      <w:r>
+        <w:t xml:space="preserve"> ha nincs bejelölve a csillag vagy szöveg nincs, ne </w:t>
+      </w:r>
+      <w:proofErr w:type="spellStart"/>
+      <w:r>
+        <w:t>errort</w:t>
+      </w:r>
+      <w:proofErr w:type="spellEnd"/>
+      <w:r>
+        <w:t xml:space="preserve"> írjon, hanem hogy mi a gond, </w:t>
+      </w:r>
+      <w:proofErr w:type="spellStart"/>
+      <w:r>
+        <w:t>pl</w:t>
+      </w:r>
+      <w:proofErr w:type="spellEnd"/>
+      <w:r>
+        <w:t xml:space="preserve"> nincs kitöltve </w:t>
+      </w:r>
+      <w:proofErr w:type="spellStart"/>
+      <w:r>
+        <w:t>vmelyik</w:t>
+      </w:r>
+      <w:proofErr w:type="spellEnd"/>
+    </w:p>
+    <w:p>
+      <w:pPr>
         <w:spacing w:after="0"/>
       </w:pPr>
-      <w:r>
-        <w:t>értékelés módosítása opció</w:t>
-      </w:r>
-    </w:p>
-    <w:p>
-      <w:pPr>
-        <w:pStyle w:val="Listaszerbekezds"/>
-        <w:numPr>
-          <w:ilvl w:val="0"/>
-          <w:numId w:val="1"/>
-        </w:numPr>
-        <w:spacing w:after="0"/>
-      </w:pPr>
-      <w:r>
-        <w:t>room értékeléskor pipa legyen az alsó résznél és ne legyen frissülés f5-el, hanem csak megjelenik az értékelés + módosítás</w:t>
-      </w:r>
-      <w:r>
-        <w:t xml:space="preserve"> + a szoba név alatt bold legyen egy szöveg, hogy melyik kategóriába tartozik</w:t>
-      </w:r>
-    </w:p>
-    <w:p>
-      <w:pPr>
-        <w:pStyle w:val="Listaszerbekezds"/>
-        <w:numPr>
-          <w:ilvl w:val="0"/>
-          <w:numId w:val="1"/>
-        </w:numPr>
-        <w:spacing w:after="0"/>
-      </w:pPr>
-      <w:r>
-        <w:t>ha lemondom a foglalást, akkor már következőleg nem fog működni a 15% kedvezmény, hiába az lesz az első tulajdonképpen</w:t>
-      </w:r>
-    </w:p>
-    <w:p>
-      <w:pPr>
-        <w:pStyle w:val="Listaszerbekezds"/>
-        <w:numPr>
-          <w:ilvl w:val="0"/>
-          <w:numId w:val="1"/>
-        </w:numPr>
-        <w:spacing w:after="0"/>
-      </w:pPr>
-      <w:r>
-        <w:t>a room foglalás utáni confirmationban legyen benne, hogy hova utaljon és mennyit és mi a foglalás száma (id, amit az emailben is ír)</w:t>
-      </w:r>
-      <w:r>
-        <w:t xml:space="preserve"> + az legyen a szöveg, hogy köszönjük a foglalást</w:t>
-      </w:r>
-    </w:p>
-    <w:p>
-      <w:pPr>
-        <w:numPr>
-          <w:ilvl w:val="0"/>
-          <w:numId w:val="1"/>
-        </w:numPr>
-      </w:pPr>
-      <w:r>
-        <w:t>a room táblában isHighlighted – így a Home oldalra is fel lehet majd rakni a kiemelteket + az adminkezeles oldalon az ac_availability-nek van egy checkbox  + room oldalon kell egy ilyen megjelenítés, hogy van-e klíma meg esetleg, hogy kiemelt</w:t>
-      </w:r>
-      <w:r>
-        <w:t xml:space="preserve"> + vélemény írásnál egy graph, hogy x/200 betű és nem enged többet</w:t>
-      </w:r>
-    </w:p>
-    <w:p>
-      <w:pPr>
-        <w:numPr>
-          <w:ilvl w:val="0"/>
-          <w:numId w:val="1"/>
-        </w:numPr>
-      </w:pPr>
-      <w:r>
-        <w:t>a saját kezelés</w:t>
-      </w:r>
-      <w:r>
-        <w:t xml:space="preserve"> meg az admin foglalások</w:t>
-      </w:r>
-      <w:r>
-        <w:t xml:space="preserve"> oldalon magyarul legyen, tehát a foglalás státusza pl magyar legyen</w:t>
-      </w:r>
-    </w:p>
-    <w:p>
-      <w:pPr>
-        <w:numPr>
-          <w:ilvl w:val="0"/>
-          <w:numId w:val="1"/>
-        </w:numPr>
-      </w:pPr>
-      <w:r>
-        <w:t>saját kezelés legyen dátum melyiket mikor foglalta</w:t>
-      </w:r>
-      <w:r>
-        <w:t xml:space="preserve"> + adatmódosításnál új jelszó megerősítése</w:t>
-      </w:r>
-      <w:r>
-        <w:t xml:space="preserve"> + telefonszámhoz ne lehessen több karakter ott sem</w:t>
-      </w:r>
-      <w:r>
-        <w:t xml:space="preserve"> és a +36 fix legyen</w:t>
-      </w:r>
-      <w:r>
-        <w:t xml:space="preserve"> + amikor adatfrissítés van akkor kapjon emailt</w:t>
-      </w:r>
-    </w:p>
-    <w:p>
-      <w:pPr>
-        <w:numPr>
-          <w:ilvl w:val="0"/>
-          <w:numId w:val="1"/>
-        </w:numPr>
-      </w:pPr>
-      <w:r>
-        <w:t>a room oldalon, amikor a foglalást leadom és még nem jött be az oldal, akkor ne jelenjen meg sárga üzenetként a room oldalon, hogy már van ott függő foglalás</w:t>
-      </w:r>
-    </w:p>
-    <w:p>
-      <w:pPr>
-        <w:numPr>
-          <w:ilvl w:val="0"/>
-          <w:numId w:val="1"/>
-        </w:numPr>
-      </w:pPr>
-      <w:r>
-        <w:t>admin foglalások oldalon ne id-kat írjon ki és ne legyen frissítés gomb meg vissza a szobákhoz se legyen</w:t>
-      </w:r>
-      <w:r>
-        <w:t xml:space="preserve"> + ne férőhelyet, mert nem az, hanem, hogy vendégek száma</w:t>
-      </w:r>
-    </w:p>
-    <w:p>
-      <w:pPr>
-        <w:numPr>
-          <w:ilvl w:val="0"/>
-          <w:numId w:val="1"/>
-        </w:numPr>
-      </w:pPr>
-      <w:r>
-        <w:t>regisztráció oldalon az email küldve zöld üzenet lent legyen, ne fent</w:t>
-      </w:r>
-    </w:p>
-    <w:p>
-      <w:pPr>
-        <w:numPr>
-          <w:ilvl w:val="0"/>
-          <w:numId w:val="1"/>
-        </w:numPr>
-      </w:pPr>
-      <w:r>
-        <w:t>alertek helyett rendes üzenetek</w:t>
-      </w:r>
-      <w:r>
-        <w:t xml:space="preserve"> középen</w:t>
-      </w:r>
-      <w:r>
-        <w:t xml:space="preserve"> és kuka gombok a kártyák jobb felső sarkában az adminon</w:t>
-      </w:r>
-    </w:p>
-    <w:p>
-      <w:pPr>
-        <w:numPr>
-          <w:ilvl w:val="0"/>
-          <w:numId w:val="1"/>
-        </w:numPr>
-      </w:pPr>
-      <w:r>
-        <w:t>category és room nincs összekötve? a room-on nem a category_id van, hanem a megnevezése</w:t>
-      </w:r>
-    </w:p>
-    <w:p>
-      <w:pPr>
-        <w:numPr>
-          <w:ilvl w:val="0"/>
-          <w:numId w:val="1"/>
-        </w:numPr>
-      </w:pPr>
-      <w:r>
-        <w:t>filter SZAR</w:t>
-      </w:r>
-    </w:p>
-    <w:p>
-      <w:pPr>
-        <w:numPr>
-          <w:ilvl w:val="0"/>
-          <w:numId w:val="1"/>
-        </w:numPr>
-      </w:pPr>
-      <w:r>
-        <w:t>admin sidebaron a foglalást nem jelzi</w:t>
-      </w:r>
-      <w:r>
-        <w:t>, a jóváhagyásra várók számát kéne mindig kiírnia, így nincs baj a session problémával</w:t>
-      </w:r>
-      <w:r>
-        <w:t>, ha bejön új és ha új session van, kiírja a felhasználóknál a piros karikában a számot, hogy vannak újak, pedig csak új session van, meg nem is kéne ott lennie, mert irreleváns</w:t>
-      </w:r>
-    </w:p>
-    <w:p>
-      <w:pPr>
-        <w:pStyle w:val="Listaszerbekezds"/>
-        <w:numPr>
-          <w:ilvl w:val="0"/>
-          <w:numId w:val="2"/>
-        </w:numPr>
-        <w:spacing w:after="0"/>
-      </w:pPr>
-      <w:r>
-        <w:t>értékelések email adminnak?</w:t>
-      </w:r>
-    </w:p>
-    <w:p>
-      <w:pPr>
-        <w:spacing w:after="0"/>
-      </w:pPr>
-    </w:p>
-    <w:p>
-      <w:pPr>
-        <w:numPr>
-          <w:ilvl w:val="0"/>
-          <w:numId w:val="2"/>
-        </w:numPr>
-      </w:pPr>
-      <w:r>
-        <w:lastRenderedPageBreak/>
-        <w:t>a figma terveket ezek szerint módosítani kell</w:t>
+    </w:p>
+    <w:p>
+      <w:pPr>
+        <w:numPr>
+          <w:ilvl w:val="0"/>
+          <w:numId w:val="2"/>
+        </w:numPr>
+      </w:pPr>
+      <w:r>
+        <w:t xml:space="preserve">a </w:t>
+      </w:r>
+      <w:proofErr w:type="spellStart"/>
+      <w:r>
+        <w:t>figma</w:t>
+      </w:r>
+      <w:proofErr w:type="spellEnd"/>
+      <w:r>
+        <w:t xml:space="preserve"> terveket ezek szerint módosítani kell</w:t>
       </w:r>
     </w:p>
     <w:sectPr>

</xml_diff>